<commit_message>
Improved PA Calculation again (according to Edney at al. Paper).
</commit_message>
<xml_diff>
--- a/Simulation Survey Data/Documentation_DataSimulation.docx
+++ b/Simulation Survey Data/Documentation_DataSimulation.docx
@@ -24,8 +24,9 @@
           <w:szCs w:val="48"/>
           <w:lang w:val="en-GB"/>
         </w:rPr>
-        <w:t xml:space="preserve">Data Simulation AIcoPA </w:t>
-      </w:r>
+        <w:t xml:space="preserve">Data Simulation </w:t>
+      </w:r>
+      <w:proofErr w:type="spellStart"/>
       <w:r>
         <w:rPr>
           <w:rFonts w:eastAsia="Segoe UI" w:cs="Arial"/>
@@ -35,6 +36,29 @@
           <w:szCs w:val="48"/>
           <w:lang w:val="en-GB"/>
         </w:rPr>
+        <w:t>AIcoPA</w:t>
+      </w:r>
+      <w:proofErr w:type="spellEnd"/>
+      <w:r>
+        <w:rPr>
+          <w:rFonts w:eastAsia="Segoe UI" w:cs="Arial"/>
+          <w:b/>
+          <w:color w:val="000000" w:themeColor="text1"/>
+          <w:sz w:val="48"/>
+          <w:szCs w:val="48"/>
+          <w:lang w:val="en-GB"/>
+        </w:rPr>
+        <w:t xml:space="preserve"> </w:t>
+      </w:r>
+      <w:r>
+        <w:rPr>
+          <w:rFonts w:eastAsia="Segoe UI" w:cs="Arial"/>
+          <w:b/>
+          <w:color w:val="000000" w:themeColor="text1"/>
+          <w:sz w:val="48"/>
+          <w:szCs w:val="48"/>
+          <w:lang w:val="en-GB"/>
+        </w:rPr>
         <w:t>Survey</w:t>
       </w:r>
     </w:p>
@@ -201,7 +225,25 @@
           <w:color w:val="000000" w:themeColor="text1"/>
           <w:lang w:val="de-CH"/>
         </w:rPr>
-        <w:t>Fall semester 2026</w:t>
+        <w:t xml:space="preserve">Fall </w:t>
+      </w:r>
+      <w:proofErr w:type="spellStart"/>
+      <w:r>
+        <w:rPr>
+          <w:rFonts w:eastAsia="Segoe UI" w:cs="Arial"/>
+          <w:color w:val="000000" w:themeColor="text1"/>
+          <w:lang w:val="de-CH"/>
+        </w:rPr>
+        <w:t>semester</w:t>
+      </w:r>
+      <w:proofErr w:type="spellEnd"/>
+      <w:r>
+        <w:rPr>
+          <w:rFonts w:eastAsia="Segoe UI" w:cs="Arial"/>
+          <w:color w:val="000000" w:themeColor="text1"/>
+          <w:lang w:val="de-CH"/>
+        </w:rPr>
+        <w:t xml:space="preserve"> 2026</w:t>
       </w:r>
     </w:p>
     <w:p>
@@ -457,8 +499,45 @@
           <w:szCs w:val="32"/>
         </w:rPr>
         <w:lastRenderedPageBreak/>
-        <w:t>Table of content</w:t>
-      </w:r>
+        <w:t xml:space="preserve">Table </w:t>
+      </w:r>
+      <w:proofErr w:type="spellStart"/>
+      <w:r>
+        <w:rPr>
+          <w:rFonts w:eastAsia="Segoe UI" w:cs="Arial"/>
+          <w:b/>
+          <w:bCs/>
+          <w:color w:val="000000" w:themeColor="text1"/>
+          <w:sz w:val="32"/>
+          <w:szCs w:val="32"/>
+        </w:rPr>
+        <w:t>of</w:t>
+      </w:r>
+      <w:proofErr w:type="spellEnd"/>
+      <w:r>
+        <w:rPr>
+          <w:rFonts w:eastAsia="Segoe UI" w:cs="Arial"/>
+          <w:b/>
+          <w:bCs/>
+          <w:color w:val="000000" w:themeColor="text1"/>
+          <w:sz w:val="32"/>
+          <w:szCs w:val="32"/>
+        </w:rPr>
+        <w:t xml:space="preserve"> </w:t>
+      </w:r>
+      <w:proofErr w:type="spellStart"/>
+      <w:r>
+        <w:rPr>
+          <w:rFonts w:eastAsia="Segoe UI" w:cs="Arial"/>
+          <w:b/>
+          <w:bCs/>
+          <w:color w:val="000000" w:themeColor="text1"/>
+          <w:sz w:val="32"/>
+          <w:szCs w:val="32"/>
+        </w:rPr>
+        <w:t>content</w:t>
+      </w:r>
+      <w:proofErr w:type="spellEnd"/>
     </w:p>
     <w:sdt>
       <w:sdtPr>
@@ -3310,7 +3389,24 @@
       </w:pPr>
       <w:bookmarkStart w:id="0" w:name="_Toc225439344"/>
       <w:r>
-        <w:t>Purpose of the Simulation</w:t>
+        <w:lastRenderedPageBreak/>
+        <w:t xml:space="preserve">Purpose </w:t>
+      </w:r>
+      <w:proofErr w:type="spellStart"/>
+      <w:r>
+        <w:t>of</w:t>
+      </w:r>
+      <w:proofErr w:type="spellEnd"/>
+      <w:r>
+        <w:t xml:space="preserve"> </w:t>
+      </w:r>
+      <w:proofErr w:type="spellStart"/>
+      <w:r>
+        <w:t>the</w:t>
+      </w:r>
+      <w:proofErr w:type="spellEnd"/>
+      <w:r>
+        <w:t xml:space="preserve"> Simulation</w:t>
       </w:r>
       <w:bookmarkEnd w:id="0"/>
     </w:p>
@@ -3337,7 +3433,35 @@
         <w:rPr>
           <w:lang w:val="en-GB"/>
         </w:rPr>
-        <w:t>physical activity intervention study within the AIcoPA project. The primary objective was to create data that resemble empirically observed patterns in health behavior research while maintaining full control over the underlying data-generating process.</w:t>
+        <w:t xml:space="preserve">physical activity intervention study within the </w:t>
+      </w:r>
+      <w:proofErr w:type="spellStart"/>
+      <w:r>
+        <w:rPr>
+          <w:lang w:val="en-GB"/>
+        </w:rPr>
+        <w:t>AIcoPA</w:t>
+      </w:r>
+      <w:proofErr w:type="spellEnd"/>
+      <w:r>
+        <w:rPr>
+          <w:lang w:val="en-GB"/>
+        </w:rPr>
+        <w:t xml:space="preserve"> project. The primary objective was to create data that resemble empirically observed patterns in health </w:t>
+      </w:r>
+      <w:proofErr w:type="spellStart"/>
+      <w:r>
+        <w:rPr>
+          <w:lang w:val="en-GB"/>
+        </w:rPr>
+        <w:t>behavior</w:t>
+      </w:r>
+      <w:proofErr w:type="spellEnd"/>
+      <w:r>
+        <w:rPr>
+          <w:lang w:val="en-GB"/>
+        </w:rPr>
+        <w:t xml:space="preserve"> research while maintaining full control over the underlying data-generating process.</w:t>
       </w:r>
     </w:p>
     <w:p>
@@ -3405,7 +3529,21 @@
         <w:rPr>
           <w:lang w:val="en-GB"/>
         </w:rPr>
-        <w:t>While the simulated data can also be used to test statistical analysis approaches (e.g., linear mixed models or structural equation models), this represents a secondary objective. The main focus lies on ensuring that the end-to-end workflow</w:t>
+        <w:t xml:space="preserve">While the simulated data can also be used to test statistical analysis approaches (e.g., linear mixed models or structural equation models), this represents a secondary objective. The </w:t>
+      </w:r>
+      <w:proofErr w:type="gramStart"/>
+      <w:r>
+        <w:rPr>
+          <w:lang w:val="en-GB"/>
+        </w:rPr>
+        <w:t>main focus</w:t>
+      </w:r>
+      <w:proofErr w:type="gramEnd"/>
+      <w:r>
+        <w:rPr>
+          <w:lang w:val="en-GB"/>
+        </w:rPr>
+        <w:t xml:space="preserve"> lies on ensuring that the end-to-end workflow</w:t>
       </w:r>
       <w:r>
         <w:rPr>
@@ -3449,8 +3587,29 @@
         <w:pStyle w:val="berschrift1"/>
       </w:pPr>
       <w:bookmarkStart w:id="1" w:name="_Toc225439345"/>
-      <w:r>
-        <w:t>Overview of the Workflow</w:t>
+      <w:proofErr w:type="spellStart"/>
+      <w:r>
+        <w:t>Overview</w:t>
+      </w:r>
+      <w:proofErr w:type="spellEnd"/>
+      <w:r>
+        <w:t xml:space="preserve"> </w:t>
+      </w:r>
+      <w:proofErr w:type="spellStart"/>
+      <w:r>
+        <w:t>of</w:t>
+      </w:r>
+      <w:proofErr w:type="spellEnd"/>
+      <w:r>
+        <w:t xml:space="preserve"> </w:t>
+      </w:r>
+      <w:proofErr w:type="spellStart"/>
+      <w:r>
+        <w:t>the</w:t>
+      </w:r>
+      <w:proofErr w:type="spellEnd"/>
+      <w:r>
+        <w:t xml:space="preserve"> Workflow</w:t>
       </w:r>
       <w:bookmarkEnd w:id="1"/>
     </w:p>
@@ -3484,59 +3643,13 @@
           <w:bCs/>
           <w:lang w:val="en-GB"/>
         </w:rPr>
-        <w:t>Data</w:t>
-      </w:r>
-      <w:r>
-        <w:rPr>
-          <w:b/>
-          <w:bCs/>
-          <w:lang w:val="en-GB"/>
-        </w:rPr>
-        <w:t xml:space="preserve"> </w:t>
-      </w:r>
-      <w:r>
-        <w:rPr>
-          <w:b/>
-          <w:bCs/>
-          <w:lang w:val="en-GB"/>
-        </w:rPr>
-        <w:t>simulation</w:t>
-      </w:r>
-      <w:r>
-        <w:rPr>
-          <w:b/>
-          <w:bCs/>
-          <w:lang w:val="en-GB"/>
-        </w:rPr>
-        <w:t xml:space="preserve"> </w:t>
-      </w:r>
-      <w:r>
-        <w:rPr>
-          <w:b/>
-          <w:bCs/>
-          <w:lang w:val="en-GB"/>
-        </w:rPr>
-        <w:t>script</w:t>
-      </w:r>
-      <w:r>
-        <w:rPr>
-          <w:b/>
-          <w:bCs/>
-          <w:lang w:val="en-GB"/>
-        </w:rPr>
-        <w:t>:</w:t>
-      </w:r>
-      <w:r>
-        <w:rPr>
-          <w:lang w:val="en-GB"/>
-        </w:rPr>
-        <w:t xml:space="preserve"> </w:t>
-      </w:r>
-      <w:r>
-        <w:rPr>
-          <w:lang w:val="en-GB"/>
-        </w:rPr>
-        <w:t xml:space="preserve">This script generates the core dataset, including participant-level characteristics, longitudinal measurements, psychological constructs, physical activity outcomes, and item-level survey responses. </w:t>
+        <w:t>Data simulation script:</w:t>
+      </w:r>
+      <w:r>
+        <w:rPr>
+          <w:lang w:val="en-GB"/>
+        </w:rPr>
+        <w:t xml:space="preserve"> This script generates the core dataset, including participant-level characteristics, longitudinal measurements, psychological constructs, physical activity outcomes, and item-level survey responses. </w:t>
       </w:r>
     </w:p>
     <w:p>
@@ -3555,15 +3668,7 @@
           <w:bCs/>
           <w:lang w:val="en-GB"/>
         </w:rPr>
-        <w:t>Mapping and export script</w:t>
-      </w:r>
-      <w:r>
-        <w:rPr>
-          <w:b/>
-          <w:bCs/>
-          <w:lang w:val="en-GB"/>
-        </w:rPr>
-        <w:t>:</w:t>
+        <w:t>Mapping and export script:</w:t>
       </w:r>
       <w:r>
         <w:rPr>
@@ -3575,7 +3680,21 @@
         <w:rPr>
           <w:lang w:val="en-GB"/>
         </w:rPr>
-        <w:t xml:space="preserve">The simulated data are transformed into a format that closely mirrors a real LimeSurvey export. This includes variable renaming, recoding into categorical labels, generation of technical variables, and alignment with an existing survey template. </w:t>
+        <w:t xml:space="preserve">The simulated data are transformed into a format that closely mirrors a real </w:t>
+      </w:r>
+      <w:proofErr w:type="spellStart"/>
+      <w:r>
+        <w:rPr>
+          <w:lang w:val="en-GB"/>
+        </w:rPr>
+        <w:t>LimeSurvey</w:t>
+      </w:r>
+      <w:proofErr w:type="spellEnd"/>
+      <w:r>
+        <w:rPr>
+          <w:lang w:val="en-GB"/>
+        </w:rPr>
+        <w:t xml:space="preserve"> export. This includes variable renaming, recoding into categorical labels, generation of technical variables, and alignment with an existing survey template. </w:t>
       </w:r>
     </w:p>
     <w:p>
@@ -3622,6 +3741,7 @@
         </w:rPr>
         <w:t xml:space="preserve"> </w:t>
       </w:r>
+      <w:proofErr w:type="gramStart"/>
       <w:r>
         <w:rPr>
           <w:lang w:val="en-GB"/>
@@ -3632,7 +3752,14 @@
         <w:rPr>
           <w:lang w:val="en-GB"/>
         </w:rPr>
-        <w:t xml:space="preserve">to </w:t>
+        <w:t>to</w:t>
+      </w:r>
+      <w:proofErr w:type="gramEnd"/>
+      <w:r>
+        <w:rPr>
+          <w:lang w:val="en-GB"/>
+        </w:rPr>
+        <w:t xml:space="preserve"> </w:t>
       </w:r>
       <w:r>
         <w:rPr>
@@ -3697,7 +3824,63 @@
         <w:rPr>
           <w:lang w:val="de-CH"/>
         </w:rPr>
-        <w:t xml:space="preserve">A template-compatible Excel file structured like a LimeSurvey export </w:t>
+        <w:t xml:space="preserve">A </w:t>
+      </w:r>
+      <w:proofErr w:type="spellStart"/>
+      <w:r>
+        <w:rPr>
+          <w:lang w:val="de-CH"/>
+        </w:rPr>
+        <w:t>template-compatible</w:t>
+      </w:r>
+      <w:proofErr w:type="spellEnd"/>
+      <w:r>
+        <w:rPr>
+          <w:lang w:val="de-CH"/>
+        </w:rPr>
+        <w:t xml:space="preserve"> Excel </w:t>
+      </w:r>
+      <w:proofErr w:type="spellStart"/>
+      <w:r>
+        <w:rPr>
+          <w:lang w:val="de-CH"/>
+        </w:rPr>
+        <w:t>file</w:t>
+      </w:r>
+      <w:proofErr w:type="spellEnd"/>
+      <w:r>
+        <w:rPr>
+          <w:lang w:val="de-CH"/>
+        </w:rPr>
+        <w:t xml:space="preserve"> </w:t>
+      </w:r>
+      <w:proofErr w:type="spellStart"/>
+      <w:r>
+        <w:rPr>
+          <w:lang w:val="de-CH"/>
+        </w:rPr>
+        <w:t>structured</w:t>
+      </w:r>
+      <w:proofErr w:type="spellEnd"/>
+      <w:r>
+        <w:rPr>
+          <w:lang w:val="de-CH"/>
+        </w:rPr>
+        <w:t xml:space="preserve"> like a LimeSurvey </w:t>
+      </w:r>
+      <w:proofErr w:type="spellStart"/>
+      <w:r>
+        <w:rPr>
+          <w:lang w:val="de-CH"/>
+        </w:rPr>
+        <w:t>export</w:t>
+      </w:r>
+      <w:proofErr w:type="spellEnd"/>
+      <w:r>
+        <w:rPr>
+          <w:lang w:val="de-CH"/>
+        </w:rPr>
+        <w:t xml:space="preserve"> </w:t>
       </w:r>
     </w:p>
     <w:p>
@@ -3754,9 +3937,22 @@
         <w:pStyle w:val="berschrift1"/>
       </w:pPr>
       <w:bookmarkStart w:id="2" w:name="_Toc225439346"/>
+      <w:proofErr w:type="spellStart"/>
       <w:r>
         <w:lastRenderedPageBreak/>
-        <w:t>Theoretical and Empirical Foundations</w:t>
+        <w:t>Theoretical</w:t>
+      </w:r>
+      <w:proofErr w:type="spellEnd"/>
+      <w:r>
+        <w:t xml:space="preserve"> and </w:t>
+      </w:r>
+      <w:proofErr w:type="spellStart"/>
+      <w:r>
+        <w:t>Empirical</w:t>
+      </w:r>
+      <w:proofErr w:type="spellEnd"/>
+      <w:r>
+        <w:t xml:space="preserve"> Foundations</w:t>
       </w:r>
       <w:bookmarkEnd w:id="2"/>
     </w:p>
@@ -3772,9 +3968,17 @@
         <w:rPr>
           <w:lang w:val="de-CH"/>
         </w:rPr>
-        <w:t>Evidence-Based Parameter Selection</w:t>
+        <w:t xml:space="preserve">Evidence-Based Parameter </w:t>
+      </w:r>
+      <w:proofErr w:type="spellStart"/>
+      <w:r>
+        <w:rPr>
+          <w:lang w:val="de-CH"/>
+        </w:rPr>
+        <w:t>Selection</w:t>
       </w:r>
       <w:bookmarkEnd w:id="3"/>
+      <w:proofErr w:type="spellEnd"/>
     </w:p>
     <w:p>
       <w:pPr>
@@ -3786,7 +3990,21 @@
         <w:rPr>
           <w:lang w:val="en-GB"/>
         </w:rPr>
-        <w:t>The simulation is informed by a structured literature review focusing on quantitative parameters relevant to health behavior research. Two complementary sources of evidence were used:</w:t>
+        <w:t xml:space="preserve">The simulation is informed by a structured literature review focusing on quantitative parameters relevant to health </w:t>
+      </w:r>
+      <w:proofErr w:type="spellStart"/>
+      <w:r>
+        <w:rPr>
+          <w:lang w:val="en-GB"/>
+        </w:rPr>
+        <w:t>behavior</w:t>
+      </w:r>
+      <w:proofErr w:type="spellEnd"/>
+      <w:r>
+        <w:rPr>
+          <w:lang w:val="en-GB"/>
+        </w:rPr>
+        <w:t xml:space="preserve"> research. Two complementary sources of evidence were used:</w:t>
       </w:r>
     </w:p>
     <w:p>
@@ -3799,7 +4017,35 @@
         <w:rPr>
           <w:lang w:val="en-GB"/>
         </w:rPr>
-        <w:t xml:space="preserve">Meta-analyses and systematic reviews, primarily providing correlations, standardized effect sizes, and theoretical relationships between constructs (e.g., intention–behavior associations in the Theory of Planned Behavior). </w:t>
+        <w:t>Meta-analyses and systematic reviews, primarily providing correlations, standardized effect sizes, and theoretical relationships between constructs (e.g., intention–</w:t>
+      </w:r>
+      <w:proofErr w:type="spellStart"/>
+      <w:r>
+        <w:rPr>
+          <w:lang w:val="en-GB"/>
+        </w:rPr>
+        <w:t>behavior</w:t>
+      </w:r>
+      <w:proofErr w:type="spellEnd"/>
+      <w:r>
+        <w:rPr>
+          <w:lang w:val="en-GB"/>
+        </w:rPr>
+        <w:t xml:space="preserve"> associations in the Theory of Planned </w:t>
+      </w:r>
+      <w:proofErr w:type="spellStart"/>
+      <w:r>
+        <w:rPr>
+          <w:lang w:val="en-GB"/>
+        </w:rPr>
+        <w:t>Behavior</w:t>
+      </w:r>
+      <w:proofErr w:type="spellEnd"/>
+      <w:r>
+        <w:rPr>
+          <w:lang w:val="en-GB"/>
+        </w:rPr>
+        <w:t xml:space="preserve">). </w:t>
       </w:r>
     </w:p>
     <w:p>
@@ -3812,7 +4058,21 @@
         <w:rPr>
           <w:lang w:val="en-GB"/>
         </w:rPr>
-        <w:t xml:space="preserve">Validation and large-scale empirical studies, providing raw score distributions (means and standard deviations) and reliability estimates for established measurement instruments (e.g., BMZI, SRBAI, planning scales). </w:t>
+        <w:t xml:space="preserve">Validation and large-scale empirical studies, providing raw score distributions (means and standard deviations) and reliability </w:t>
+      </w:r>
+      <w:proofErr w:type="gramStart"/>
+      <w:r>
+        <w:rPr>
+          <w:lang w:val="en-GB"/>
+        </w:rPr>
+        <w:t>estimates</w:t>
+      </w:r>
+      <w:proofErr w:type="gramEnd"/>
+      <w:r>
+        <w:rPr>
+          <w:lang w:val="en-GB"/>
+        </w:rPr>
+        <w:t xml:space="preserve"> for established measurement instruments (e.g., BMZI, SRBAI, planning scales). </w:t>
       </w:r>
     </w:p>
     <w:p>
@@ -3825,7 +4085,35 @@
         <w:rPr>
           <w:lang w:val="en-GB"/>
         </w:rPr>
-        <w:t>For several constructs, particularly within the Theory of Planned Behavior and the Technology Acceptance Model, no consistent pooled baseline means and standard deviations are available due to heterogeneity in measurement scales across studies. In these cases, plausible parameter ranges were defined based on theoretical expectations and typical value ranges reported in the literature.</w:t>
+        <w:t xml:space="preserve">For several constructs, particularly within the Theory of Planned </w:t>
+      </w:r>
+      <w:proofErr w:type="spellStart"/>
+      <w:r>
+        <w:rPr>
+          <w:lang w:val="en-GB"/>
+        </w:rPr>
+        <w:t>Behavior</w:t>
+      </w:r>
+      <w:proofErr w:type="spellEnd"/>
+      <w:r>
+        <w:rPr>
+          <w:lang w:val="en-GB"/>
+        </w:rPr>
+        <w:t xml:space="preserve"> and the Technology Acceptance Model, no consistent pooled baseline </w:t>
+      </w:r>
+      <w:proofErr w:type="gramStart"/>
+      <w:r>
+        <w:rPr>
+          <w:lang w:val="en-GB"/>
+        </w:rPr>
+        <w:t>means</w:t>
+      </w:r>
+      <w:proofErr w:type="gramEnd"/>
+      <w:r>
+        <w:rPr>
+          <w:lang w:val="en-GB"/>
+        </w:rPr>
+        <w:t xml:space="preserve"> and standard deviations are available due to heterogeneity in measurement scales across studies. In these cases, plausible parameter ranges were defined based on theoretical expectations and typical value ranges reported in the literature.</w:t>
       </w:r>
     </w:p>
     <w:p>
@@ -3861,11 +4149,19 @@
         </w:rPr>
       </w:pPr>
       <w:bookmarkStart w:id="4" w:name="_Toc225439348"/>
+      <w:proofErr w:type="spellStart"/>
       <w:r>
         <w:rPr>
           <w:lang w:val="de-CH"/>
         </w:rPr>
-        <w:t>Modeled Psychological Frameworks</w:t>
+        <w:t>Modeled</w:t>
+      </w:r>
+      <w:proofErr w:type="spellEnd"/>
+      <w:r>
+        <w:rPr>
+          <w:lang w:val="de-CH"/>
+        </w:rPr>
+        <w:t xml:space="preserve"> Psychological Frameworks</w:t>
       </w:r>
       <w:bookmarkEnd w:id="4"/>
     </w:p>
@@ -3879,7 +4175,21 @@
         <w:rPr>
           <w:lang w:val="en-GB"/>
         </w:rPr>
-        <w:t>The simulation integrates multiple theoretical frameworks commonly used in physical activity and health behavior research:</w:t>
+        <w:t xml:space="preserve">The simulation integrates multiple theoretical frameworks commonly used in physical activity and health </w:t>
+      </w:r>
+      <w:proofErr w:type="spellStart"/>
+      <w:r>
+        <w:rPr>
+          <w:lang w:val="en-GB"/>
+        </w:rPr>
+        <w:t>behavior</w:t>
+      </w:r>
+      <w:proofErr w:type="spellEnd"/>
+      <w:r>
+        <w:rPr>
+          <w:lang w:val="en-GB"/>
+        </w:rPr>
+        <w:t xml:space="preserve"> research:</w:t>
       </w:r>
     </w:p>
     <w:p>
@@ -3914,7 +4224,35 @@
         <w:rPr>
           <w:lang w:val="en-GB"/>
         </w:rPr>
-        <w:t xml:space="preserve">Habit strength is modeled as a key determinant of behavior, informed by research on automaticity and habit formation. </w:t>
+        <w:t xml:space="preserve">Habit strength is </w:t>
+      </w:r>
+      <w:proofErr w:type="spellStart"/>
+      <w:r>
+        <w:rPr>
+          <w:lang w:val="en-GB"/>
+        </w:rPr>
+        <w:t>modeled</w:t>
+      </w:r>
+      <w:proofErr w:type="spellEnd"/>
+      <w:r>
+        <w:rPr>
+          <w:lang w:val="en-GB"/>
+        </w:rPr>
+        <w:t xml:space="preserve"> as a key determinant of </w:t>
+      </w:r>
+      <w:proofErr w:type="spellStart"/>
+      <w:r>
+        <w:rPr>
+          <w:lang w:val="en-GB"/>
+        </w:rPr>
+        <w:t>behavior</w:t>
+      </w:r>
+      <w:proofErr w:type="spellEnd"/>
+      <w:r>
+        <w:rPr>
+          <w:lang w:val="en-GB"/>
+        </w:rPr>
+        <w:t xml:space="preserve">, informed by research on automaticity and habit formation. </w:t>
       </w:r>
     </w:p>
     <w:p>
@@ -3929,14 +4267,32 @@
           <w:bCs/>
           <w:lang w:val="en-GB"/>
         </w:rPr>
-        <w:t>Theory of Planned Behavior (TPB)</w:t>
-      </w:r>
+        <w:t xml:space="preserve">Theory of Planned </w:t>
+      </w:r>
+      <w:proofErr w:type="spellStart"/>
       <w:r>
         <w:rPr>
           <w:b/>
           <w:bCs/>
           <w:lang w:val="en-GB"/>
         </w:rPr>
+        <w:t>Behavior</w:t>
+      </w:r>
+      <w:proofErr w:type="spellEnd"/>
+      <w:r>
+        <w:rPr>
+          <w:b/>
+          <w:bCs/>
+          <w:lang w:val="en-GB"/>
+        </w:rPr>
+        <w:t xml:space="preserve"> (TPB)</w:t>
+      </w:r>
+      <w:r>
+        <w:rPr>
+          <w:b/>
+          <w:bCs/>
+          <w:lang w:val="en-GB"/>
+        </w:rPr>
         <w:t>:</w:t>
       </w:r>
       <w:r>
@@ -3949,7 +4305,27 @@
         <w:rPr>
           <w:lang w:val="en-GB"/>
         </w:rPr>
-        <w:t xml:space="preserve">Core constructs include intention, attitude, injunctive and descriptive norms, and perceived behavioral control. Relationships between these constructs and behavior follow meta-analytically supported patterns. </w:t>
+        <w:t>Core constructs include intention, attitude, and perceived behavioral control.</w:t>
+      </w:r>
+      <w:r>
+        <w:rPr>
+          <w:lang w:val="en-GB"/>
+        </w:rPr>
+        <w:t xml:space="preserve"> Relationships between these constructs and </w:t>
+      </w:r>
+      <w:proofErr w:type="spellStart"/>
+      <w:r>
+        <w:rPr>
+          <w:lang w:val="en-GB"/>
+        </w:rPr>
+        <w:t>behavior</w:t>
+      </w:r>
+      <w:proofErr w:type="spellEnd"/>
+      <w:r>
+        <w:rPr>
+          <w:lang w:val="en-GB"/>
+        </w:rPr>
+        <w:t xml:space="preserve"> follow meta-analytically supported patterns. </w:t>
       </w:r>
     </w:p>
     <w:p>
@@ -3984,7 +4360,13 @@
         <w:rPr>
           <w:lang w:val="en-GB"/>
         </w:rPr>
-        <w:t xml:space="preserve">Autonomous and controlled motivation are represented as distinct constructs, with baseline differences reflecting typical empirical findings (i.e., higher autonomous than controlled motivation). </w:t>
+        <w:t xml:space="preserve">Intrinsic and extrinsic motivation are represented as distinct constructs. </w:t>
+      </w:r>
+      <w:r>
+        <w:rPr>
+          <w:lang w:val="en-GB"/>
+        </w:rPr>
+        <w:t>In addition, perceived competence and perceived choice are included as core SDT-based variables.</w:t>
       </w:r>
     </w:p>
     <w:p>
@@ -4019,7 +4401,21 @@
         <w:rPr>
           <w:lang w:val="en-GB"/>
         </w:rPr>
-        <w:t xml:space="preserve">Action planning and self-control are included as key post-intentional processes influencing behavior. </w:t>
+        <w:t xml:space="preserve">Action planning and self-control are included as key post-intentional processes influencing </w:t>
+      </w:r>
+      <w:proofErr w:type="spellStart"/>
+      <w:r>
+        <w:rPr>
+          <w:lang w:val="en-GB"/>
+        </w:rPr>
+        <w:t>behavior</w:t>
+      </w:r>
+      <w:proofErr w:type="spellEnd"/>
+      <w:r>
+        <w:rPr>
+          <w:lang w:val="en-GB"/>
+        </w:rPr>
+        <w:t xml:space="preserve">. </w:t>
       </w:r>
     </w:p>
     <w:p>
@@ -4034,14 +4430,32 @@
           <w:bCs/>
           <w:lang w:val="en-GB"/>
         </w:rPr>
-        <w:t>Motivational constructs (BMZI and ZiMo)</w:t>
-      </w:r>
+        <w:t xml:space="preserve">Motivational constructs (BMZI and </w:t>
+      </w:r>
+      <w:proofErr w:type="spellStart"/>
       <w:r>
         <w:rPr>
           <w:b/>
           <w:bCs/>
           <w:lang w:val="en-GB"/>
         </w:rPr>
+        <w:t>ZiMo</w:t>
+      </w:r>
+      <w:proofErr w:type="spellEnd"/>
+      <w:r>
+        <w:rPr>
+          <w:b/>
+          <w:bCs/>
+          <w:lang w:val="en-GB"/>
+        </w:rPr>
+        <w:t>)</w:t>
+      </w:r>
+      <w:r>
+        <w:rPr>
+          <w:b/>
+          <w:bCs/>
+          <w:lang w:val="en-GB"/>
+        </w:rPr>
         <w:t>:</w:t>
       </w:r>
       <w:r>
@@ -4054,7 +4468,35 @@
         <w:rPr>
           <w:lang w:val="en-GB"/>
         </w:rPr>
-        <w:t xml:space="preserve">Domain-specific motives for physical activity are modeled using empirically informed distributions, particularly for BMZI subscales. Additional ZiMo-related constructs were partially simulated directly and partially derived. </w:t>
+        <w:t xml:space="preserve">Domain-specific motives for physical activity are </w:t>
+      </w:r>
+      <w:proofErr w:type="spellStart"/>
+      <w:r>
+        <w:rPr>
+          <w:lang w:val="en-GB"/>
+        </w:rPr>
+        <w:t>modeled</w:t>
+      </w:r>
+      <w:proofErr w:type="spellEnd"/>
+      <w:r>
+        <w:rPr>
+          <w:lang w:val="en-GB"/>
+        </w:rPr>
+        <w:t xml:space="preserve"> using empirically informed distributions, particularly for BMZI subscales. Additional </w:t>
+      </w:r>
+      <w:proofErr w:type="spellStart"/>
+      <w:r>
+        <w:rPr>
+          <w:lang w:val="en-GB"/>
+        </w:rPr>
+        <w:t>ZiMo</w:t>
+      </w:r>
+      <w:proofErr w:type="spellEnd"/>
+      <w:r>
+        <w:rPr>
+          <w:lang w:val="en-GB"/>
+        </w:rPr>
+        <w:t xml:space="preserve">-related constructs were partially simulated directly and partially derived. </w:t>
       </w:r>
     </w:p>
     <w:p>
@@ -4115,7 +4557,21 @@
         <w:rPr>
           <w:lang w:val="en-GB"/>
         </w:rPr>
-        <w:t>Together, these frameworks form a comprehensive representation of motivational, cognitive, and behavioral processes underlying physical activity.</w:t>
+        <w:t xml:space="preserve">Together, these frameworks form a comprehensive representation of motivational, cognitive, and </w:t>
+      </w:r>
+      <w:proofErr w:type="spellStart"/>
+      <w:r>
+        <w:rPr>
+          <w:lang w:val="en-GB"/>
+        </w:rPr>
+        <w:t>behavioral</w:t>
+      </w:r>
+      <w:proofErr w:type="spellEnd"/>
+      <w:r>
+        <w:rPr>
+          <w:lang w:val="en-GB"/>
+        </w:rPr>
+        <w:t xml:space="preserve"> processes underlying physical activity.</w:t>
       </w:r>
     </w:p>
     <w:p>
@@ -4126,13 +4582,29 @@
         </w:rPr>
       </w:pPr>
       <w:bookmarkStart w:id="5" w:name="_Toc225439349"/>
+      <w:proofErr w:type="spellStart"/>
       <w:r>
         <w:rPr>
           <w:lang w:val="de-CH"/>
         </w:rPr>
-        <w:t>Sociodemographic Effects</w:t>
+        <w:t>Sociodemographic</w:t>
+      </w:r>
+      <w:proofErr w:type="spellEnd"/>
+      <w:r>
+        <w:rPr>
+          <w:lang w:val="de-CH"/>
+        </w:rPr>
+        <w:t xml:space="preserve"> </w:t>
+      </w:r>
+      <w:proofErr w:type="spellStart"/>
+      <w:r>
+        <w:rPr>
+          <w:lang w:val="de-CH"/>
+        </w:rPr>
+        <w:t>Effects</w:t>
       </w:r>
       <w:bookmarkEnd w:id="5"/>
+      <w:proofErr w:type="spellEnd"/>
     </w:p>
     <w:p>
       <w:pPr>
@@ -4157,7 +4629,21 @@
         <w:rPr>
           <w:lang w:val="en-GB"/>
         </w:rPr>
-        <w:t>These variables are modeled as exogenous predictors influencing both:</w:t>
+        <w:t xml:space="preserve">These variables are </w:t>
+      </w:r>
+      <w:proofErr w:type="spellStart"/>
+      <w:r>
+        <w:rPr>
+          <w:lang w:val="en-GB"/>
+        </w:rPr>
+        <w:t>modeled</w:t>
+      </w:r>
+      <w:proofErr w:type="spellEnd"/>
+      <w:r>
+        <w:rPr>
+          <w:lang w:val="en-GB"/>
+        </w:rPr>
+        <w:t xml:space="preserve"> as exogenous predictors influencing both:</w:t>
       </w:r>
       <w:r>
         <w:rPr>
@@ -4169,7 +4655,21 @@
         <w:rPr>
           <w:lang w:val="en-GB"/>
         </w:rPr>
-        <w:t xml:space="preserve">physical activity outcomes, and app usage behavior. </w:t>
+        <w:t xml:space="preserve">physical activity outcomes, and app usage </w:t>
+      </w:r>
+      <w:proofErr w:type="spellStart"/>
+      <w:r>
+        <w:rPr>
+          <w:lang w:val="en-GB"/>
+        </w:rPr>
+        <w:t>behavior</w:t>
+      </w:r>
+      <w:proofErr w:type="spellEnd"/>
+      <w:r>
+        <w:rPr>
+          <w:lang w:val="en-GB"/>
+        </w:rPr>
+        <w:t xml:space="preserve">. </w:t>
       </w:r>
       <w:r>
         <w:rPr>
@@ -4201,7 +4701,14 @@
         <w:rPr>
           <w:lang w:val="en-GB"/>
         </w:rPr>
-        <w:t xml:space="preserve"> is associated with higher engagement and activity levels, </w:t>
+        <w:t xml:space="preserve"> is associated with higher engagement and activity </w:t>
+      </w:r>
+      <w:proofErr w:type="gramStart"/>
+      <w:r>
+        <w:rPr>
+          <w:lang w:val="en-GB"/>
+        </w:rPr>
+        <w:t xml:space="preserve">levels, </w:t>
       </w:r>
       <w:r>
         <w:rPr>
@@ -4217,11 +4724,26 @@
         </w:rPr>
         <w:t>age</w:t>
       </w:r>
-      <w:r>
-        <w:rPr>
-          <w:lang w:val="en-GB"/>
-        </w:rPr>
-        <w:t xml:space="preserve"> shows a non-linear relationship with behavior (with middle age ranges often more active), and </w:t>
+      <w:proofErr w:type="gramEnd"/>
+      <w:r>
+        <w:rPr>
+          <w:lang w:val="en-GB"/>
+        </w:rPr>
+        <w:t xml:space="preserve"> shows a non-linear relationship with </w:t>
+      </w:r>
+      <w:proofErr w:type="spellStart"/>
+      <w:r>
+        <w:rPr>
+          <w:lang w:val="en-GB"/>
+        </w:rPr>
+        <w:t>behavior</w:t>
+      </w:r>
+      <w:proofErr w:type="spellEnd"/>
+      <w:r>
+        <w:rPr>
+          <w:lang w:val="en-GB"/>
+        </w:rPr>
+        <w:t xml:space="preserve"> (with middle age ranges often more active), and </w:t>
       </w:r>
       <w:r>
         <w:rPr>
@@ -4270,8 +4792,13 @@
         <w:pStyle w:val="berschrift1"/>
       </w:pPr>
       <w:bookmarkStart w:id="6" w:name="_Toc225439350"/>
-      <w:r>
-        <w:t>Script 1: Data Simulation</w:t>
+      <w:proofErr w:type="spellStart"/>
+      <w:r>
+        <w:t>Script</w:t>
+      </w:r>
+      <w:proofErr w:type="spellEnd"/>
+      <w:r>
+        <w:t xml:space="preserve"> 1: Data Simulation</w:t>
       </w:r>
       <w:bookmarkEnd w:id="6"/>
     </w:p>
@@ -4280,11 +4807,16 @@
         <w:pStyle w:val="berschrift2"/>
       </w:pPr>
       <w:bookmarkStart w:id="7" w:name="_Toc225439351"/>
+      <w:proofErr w:type="spellStart"/>
       <w:r>
         <w:t>S</w:t>
       </w:r>
       <w:r>
-        <w:t>imulated S</w:t>
+        <w:t>imulated</w:t>
+      </w:r>
+      <w:proofErr w:type="spellEnd"/>
+      <w:r>
+        <w:t xml:space="preserve"> S</w:t>
       </w:r>
       <w:r>
         <w:t>tudy Design</w:t>
@@ -4315,31 +4847,7 @@
         <w:rPr>
           <w:lang w:val="en-GB"/>
         </w:rPr>
-        <w:t xml:space="preserve"> participants. Each participant is assigned to one of two study groups:</w:t>
-      </w:r>
-      <w:r>
-        <w:rPr>
-          <w:lang w:val="en-GB"/>
-        </w:rPr>
-        <w:t xml:space="preserve"> </w:t>
-      </w:r>
-      <w:r>
-        <w:rPr>
-          <w:lang w:val="en-GB"/>
-        </w:rPr>
-        <w:t xml:space="preserve">Intervention Group (IG) </w:t>
-      </w:r>
-      <w:r>
-        <w:rPr>
-          <w:lang w:val="en-GB"/>
-        </w:rPr>
-        <w:t xml:space="preserve">or </w:t>
-      </w:r>
-      <w:r>
-        <w:rPr>
-          <w:lang w:val="en-GB"/>
-        </w:rPr>
-        <w:t xml:space="preserve">Control Group (CG) </w:t>
+        <w:t xml:space="preserve"> participants. Each participant is assigned to one of two study groups: Intervention Group (IG) or Control Group (CG) </w:t>
       </w:r>
     </w:p>
     <w:p>
@@ -4477,7 +4985,21 @@
         <w:rPr>
           <w:lang w:val="en-GB"/>
         </w:rPr>
-        <w:t>A predefined correlation matrix is used to induce realistic associations between constructs, based on meta-analytic evidence (e.g., correlations among TPB variables and between motivation and behavior).</w:t>
+        <w:t xml:space="preserve">A predefined correlation matrix is used to induce realistic associations between constructs, based on meta-analytic evidence (e.g., correlations among TPB variables and between motivation and </w:t>
+      </w:r>
+      <w:proofErr w:type="spellStart"/>
+      <w:r>
+        <w:rPr>
+          <w:lang w:val="en-GB"/>
+        </w:rPr>
+        <w:t>behavior</w:t>
+      </w:r>
+      <w:proofErr w:type="spellEnd"/>
+      <w:r>
+        <w:rPr>
+          <w:lang w:val="en-GB"/>
+        </w:rPr>
+        <w:t>).</w:t>
       </w:r>
       <w:r>
         <w:rPr>
@@ -4517,9 +5039,17 @@
         <w:rPr>
           <w:lang w:val="de-CH"/>
         </w:rPr>
-        <w:t>Intervention and Time Effects</w:t>
+        <w:t xml:space="preserve">Intervention and Time </w:t>
+      </w:r>
+      <w:proofErr w:type="spellStart"/>
+      <w:r>
+        <w:rPr>
+          <w:lang w:val="de-CH"/>
+        </w:rPr>
+        <w:t>Effects</w:t>
       </w:r>
       <w:bookmarkEnd w:id="9"/>
+      <w:proofErr w:type="spellEnd"/>
     </w:p>
     <w:p>
       <w:pPr>
@@ -4573,7 +5103,35 @@
         <w:rPr>
           <w:lang w:val="de-CH"/>
         </w:rPr>
-        <w:t xml:space="preserve">a baseline mean, </w:t>
+        <w:t xml:space="preserve">a </w:t>
+      </w:r>
+      <w:proofErr w:type="spellStart"/>
+      <w:r>
+        <w:rPr>
+          <w:lang w:val="de-CH"/>
+        </w:rPr>
+        <w:t>baseline</w:t>
+      </w:r>
+      <w:proofErr w:type="spellEnd"/>
+      <w:r>
+        <w:rPr>
+          <w:lang w:val="de-CH"/>
+        </w:rPr>
+        <w:t xml:space="preserve"> </w:t>
+      </w:r>
+      <w:proofErr w:type="spellStart"/>
+      <w:r>
+        <w:rPr>
+          <w:lang w:val="de-CH"/>
+        </w:rPr>
+        <w:t>mean</w:t>
+      </w:r>
+      <w:proofErr w:type="spellEnd"/>
+      <w:r>
+        <w:rPr>
+          <w:lang w:val="de-CH"/>
+        </w:rPr>
+        <w:t xml:space="preserve">, </w:t>
       </w:r>
     </w:p>
     <w:p>
@@ -4586,11 +5144,47 @@
           <w:lang w:val="de-CH"/>
         </w:rPr>
       </w:pPr>
+      <w:proofErr w:type="spellStart"/>
       <w:r>
         <w:rPr>
           <w:lang w:val="de-CH"/>
         </w:rPr>
-        <w:t xml:space="preserve">the person-specific latent deviation, </w:t>
+        <w:t>the</w:t>
+      </w:r>
+      <w:proofErr w:type="spellEnd"/>
+      <w:r>
+        <w:rPr>
+          <w:lang w:val="de-CH"/>
+        </w:rPr>
+        <w:t xml:space="preserve"> </w:t>
+      </w:r>
+      <w:proofErr w:type="spellStart"/>
+      <w:r>
+        <w:rPr>
+          <w:lang w:val="de-CH"/>
+        </w:rPr>
+        <w:t>person-specific</w:t>
+      </w:r>
+      <w:proofErr w:type="spellEnd"/>
+      <w:r>
+        <w:rPr>
+          <w:lang w:val="de-CH"/>
+        </w:rPr>
+        <w:t xml:space="preserve"> latent </w:t>
+      </w:r>
+      <w:proofErr w:type="spellStart"/>
+      <w:r>
+        <w:rPr>
+          <w:lang w:val="de-CH"/>
+        </w:rPr>
+        <w:t>deviation</w:t>
+      </w:r>
+      <w:proofErr w:type="spellEnd"/>
+      <w:r>
+        <w:rPr>
+          <w:lang w:val="de-CH"/>
+        </w:rPr>
+        <w:t xml:space="preserve">, </w:t>
       </w:r>
     </w:p>
     <w:p>
@@ -4603,11 +5197,47 @@
           <w:lang w:val="de-CH"/>
         </w:rPr>
       </w:pPr>
+      <w:proofErr w:type="spellStart"/>
       <w:r>
         <w:rPr>
           <w:lang w:val="de-CH"/>
         </w:rPr>
-        <w:t xml:space="preserve">treatment and carryover effects, </w:t>
+        <w:t>treatment</w:t>
+      </w:r>
+      <w:proofErr w:type="spellEnd"/>
+      <w:r>
+        <w:rPr>
+          <w:lang w:val="de-CH"/>
+        </w:rPr>
+        <w:t xml:space="preserve"> and </w:t>
+      </w:r>
+      <w:proofErr w:type="spellStart"/>
+      <w:r>
+        <w:rPr>
+          <w:lang w:val="de-CH"/>
+        </w:rPr>
+        <w:t>carryover</w:t>
+      </w:r>
+      <w:proofErr w:type="spellEnd"/>
+      <w:r>
+        <w:rPr>
+          <w:lang w:val="de-CH"/>
+        </w:rPr>
+        <w:t xml:space="preserve"> </w:t>
+      </w:r>
+      <w:proofErr w:type="spellStart"/>
+      <w:r>
+        <w:rPr>
+          <w:lang w:val="de-CH"/>
+        </w:rPr>
+        <w:t>effects</w:t>
+      </w:r>
+      <w:proofErr w:type="spellEnd"/>
+      <w:r>
+        <w:rPr>
+          <w:lang w:val="de-CH"/>
+        </w:rPr>
+        <w:t xml:space="preserve">, </w:t>
       </w:r>
     </w:p>
     <w:p>
@@ -4670,7 +5300,21 @@
         <w:rPr>
           <w:lang w:val="de-CH"/>
         </w:rPr>
-        <w:t xml:space="preserve">Habit (automaticity) </w:t>
+        <w:t>Habit (</w:t>
+      </w:r>
+      <w:proofErr w:type="spellStart"/>
+      <w:r>
+        <w:rPr>
+          <w:lang w:val="de-CH"/>
+        </w:rPr>
+        <w:t>automaticity</w:t>
+      </w:r>
+      <w:proofErr w:type="spellEnd"/>
+      <w:r>
+        <w:rPr>
+          <w:lang w:val="de-CH"/>
+        </w:rPr>
+        <w:t xml:space="preserve">) </w:t>
       </w:r>
     </w:p>
     <w:p>
@@ -4687,7 +5331,21 @@
         <w:rPr>
           <w:lang w:val="en-GB"/>
         </w:rPr>
-        <w:t xml:space="preserve">Intention, attitude, injunctive norms, descriptive norms, and perceived behavioral control (TPB) </w:t>
+        <w:t xml:space="preserve">Intention, attitude, injunctive norms, descriptive norms, and perceived </w:t>
+      </w:r>
+      <w:proofErr w:type="spellStart"/>
+      <w:r>
+        <w:rPr>
+          <w:lang w:val="en-GB"/>
+        </w:rPr>
+        <w:t>behavioral</w:t>
+      </w:r>
+      <w:proofErr w:type="spellEnd"/>
+      <w:r>
+        <w:rPr>
+          <w:lang w:val="en-GB"/>
+        </w:rPr>
+        <w:t xml:space="preserve"> control (TPB) </w:t>
       </w:r>
     </w:p>
     <w:p>
@@ -4721,7 +5379,35 @@
         <w:rPr>
           <w:lang w:val="de-CH"/>
         </w:rPr>
-        <w:t xml:space="preserve">Action planning and self-control </w:t>
+        <w:t xml:space="preserve">Action </w:t>
+      </w:r>
+      <w:proofErr w:type="spellStart"/>
+      <w:r>
+        <w:rPr>
+          <w:lang w:val="de-CH"/>
+        </w:rPr>
+        <w:t>planning</w:t>
+      </w:r>
+      <w:proofErr w:type="spellEnd"/>
+      <w:r>
+        <w:rPr>
+          <w:lang w:val="de-CH"/>
+        </w:rPr>
+        <w:t xml:space="preserve"> and </w:t>
+      </w:r>
+      <w:proofErr w:type="spellStart"/>
+      <w:r>
+        <w:rPr>
+          <w:lang w:val="de-CH"/>
+        </w:rPr>
+        <w:t>self-control</w:t>
+      </w:r>
+      <w:proofErr w:type="spellEnd"/>
+      <w:r>
+        <w:rPr>
+          <w:lang w:val="de-CH"/>
+        </w:rPr>
+        <w:t xml:space="preserve"> </w:t>
       </w:r>
     </w:p>
     <w:p>
@@ -4738,7 +5424,21 @@
         <w:rPr>
           <w:lang w:val="en-GB"/>
         </w:rPr>
-        <w:t xml:space="preserve">Additional motivational constructs (e.g., ZiMo-related variables) </w:t>
+        <w:t xml:space="preserve">Additional motivational constructs (e.g., </w:t>
+      </w:r>
+      <w:proofErr w:type="spellStart"/>
+      <w:r>
+        <w:rPr>
+          <w:lang w:val="en-GB"/>
+        </w:rPr>
+        <w:t>ZiMo</w:t>
+      </w:r>
+      <w:proofErr w:type="spellEnd"/>
+      <w:r>
+        <w:rPr>
+          <w:lang w:val="en-GB"/>
+        </w:rPr>
+        <w:t xml:space="preserve">-related variables) </w:t>
       </w:r>
     </w:p>
     <w:p>
@@ -4788,7 +5488,21 @@
         <w:rPr>
           <w:lang w:val="en-GB"/>
         </w:rPr>
-        <w:t>For the ZiMo-related constructs in particular, parameter values (means and standard deviations) were aligned with published descriptive statistics from BMZI-based research to ensure realistic distributions of motivational variables.</w:t>
+        <w:t xml:space="preserve">For the </w:t>
+      </w:r>
+      <w:proofErr w:type="spellStart"/>
+      <w:r>
+        <w:rPr>
+          <w:lang w:val="en-GB"/>
+        </w:rPr>
+        <w:t>ZiMo</w:t>
+      </w:r>
+      <w:proofErr w:type="spellEnd"/>
+      <w:r>
+        <w:rPr>
+          <w:lang w:val="en-GB"/>
+        </w:rPr>
+        <w:t>-related constructs in particular, parameter values (means and standard deviations) were aligned with published descriptive statistics from BMZI-based research to ensure realistic distributions of motivational variables.</w:t>
       </w:r>
     </w:p>
     <w:p>
@@ -4801,7 +5515,21 @@
         <w:rPr>
           <w:lang w:val="en-GB"/>
         </w:rPr>
-        <w:t>In addition, some constructs are modeled as functionally related:</w:t>
+        <w:t xml:space="preserve">In addition, some constructs are </w:t>
+      </w:r>
+      <w:proofErr w:type="spellStart"/>
+      <w:r>
+        <w:rPr>
+          <w:lang w:val="en-GB"/>
+        </w:rPr>
+        <w:t>modeled</w:t>
+      </w:r>
+      <w:proofErr w:type="spellEnd"/>
+      <w:r>
+        <w:rPr>
+          <w:lang w:val="en-GB"/>
+        </w:rPr>
+        <w:t xml:space="preserve"> as functionally related:</w:t>
       </w:r>
     </w:p>
     <w:p>
@@ -4814,11 +5542,19 @@
           <w:lang w:val="en-GB"/>
         </w:rPr>
       </w:pPr>
-      <w:r>
-        <w:rPr>
-          <w:lang w:val="en-GB"/>
-        </w:rPr>
-        <w:t xml:space="preserve">ZiMo constructs partly depend on autonomous motivation and attitudes, </w:t>
+      <w:proofErr w:type="spellStart"/>
+      <w:r>
+        <w:rPr>
+          <w:lang w:val="en-GB"/>
+        </w:rPr>
+        <w:t>ZiMo</w:t>
+      </w:r>
+      <w:proofErr w:type="spellEnd"/>
+      <w:r>
+        <w:rPr>
+          <w:lang w:val="en-GB"/>
+        </w:rPr>
+        <w:t xml:space="preserve"> constructs partly depend on autonomous motivation and attitudes, </w:t>
       </w:r>
     </w:p>
     <w:p>
@@ -4835,7 +5571,63 @@
         <w:rPr>
           <w:lang w:val="de-CH"/>
         </w:rPr>
-        <w:t xml:space="preserve">behavioral drivers combine multiple psychological predictors. </w:t>
+        <w:t xml:space="preserve">behavioral </w:t>
+      </w:r>
+      <w:proofErr w:type="spellStart"/>
+      <w:r>
+        <w:rPr>
+          <w:lang w:val="de-CH"/>
+        </w:rPr>
+        <w:t>drivers</w:t>
+      </w:r>
+      <w:proofErr w:type="spellEnd"/>
+      <w:r>
+        <w:rPr>
+          <w:lang w:val="de-CH"/>
+        </w:rPr>
+        <w:t xml:space="preserve"> </w:t>
+      </w:r>
+      <w:proofErr w:type="spellStart"/>
+      <w:r>
+        <w:rPr>
+          <w:lang w:val="de-CH"/>
+        </w:rPr>
+        <w:t>combine</w:t>
+      </w:r>
+      <w:proofErr w:type="spellEnd"/>
+      <w:r>
+        <w:rPr>
+          <w:lang w:val="de-CH"/>
+        </w:rPr>
+        <w:t xml:space="preserve"> multiple </w:t>
+      </w:r>
+      <w:proofErr w:type="spellStart"/>
+      <w:r>
+        <w:rPr>
+          <w:lang w:val="de-CH"/>
+        </w:rPr>
+        <w:t>psychological</w:t>
+      </w:r>
+      <w:proofErr w:type="spellEnd"/>
+      <w:r>
+        <w:rPr>
+          <w:lang w:val="de-CH"/>
+        </w:rPr>
+        <w:t xml:space="preserve"> </w:t>
+      </w:r>
+      <w:proofErr w:type="spellStart"/>
+      <w:r>
+        <w:rPr>
+          <w:lang w:val="de-CH"/>
+        </w:rPr>
+        <w:t>predictors</w:t>
+      </w:r>
+      <w:proofErr w:type="spellEnd"/>
+      <w:r>
+        <w:rPr>
+          <w:lang w:val="de-CH"/>
+        </w:rPr>
+        <w:t xml:space="preserve">. </w:t>
       </w:r>
     </w:p>
     <w:p>
@@ -4850,7 +5642,49 @@
         <w:rPr>
           <w:lang w:val="de-CH"/>
         </w:rPr>
-        <w:t>Generation of Physical Activity Outcomes</w:t>
+        <w:t xml:space="preserve">Generation </w:t>
+      </w:r>
+      <w:proofErr w:type="spellStart"/>
+      <w:r>
+        <w:rPr>
+          <w:lang w:val="de-CH"/>
+        </w:rPr>
+        <w:t>of</w:t>
+      </w:r>
+      <w:proofErr w:type="spellEnd"/>
+      <w:r>
+        <w:rPr>
+          <w:lang w:val="de-CH"/>
+        </w:rPr>
+        <w:t xml:space="preserve"> </w:t>
+      </w:r>
+      <w:proofErr w:type="spellStart"/>
+      <w:r>
+        <w:rPr>
+          <w:lang w:val="de-CH"/>
+        </w:rPr>
+        <w:t>Physical</w:t>
+      </w:r>
+      <w:proofErr w:type="spellEnd"/>
+      <w:r>
+        <w:rPr>
+          <w:lang w:val="de-CH"/>
+        </w:rPr>
+        <w:t xml:space="preserve"> </w:t>
+      </w:r>
+      <w:proofErr w:type="spellStart"/>
+      <w:r>
+        <w:rPr>
+          <w:lang w:val="de-CH"/>
+        </w:rPr>
+        <w:t>Activity</w:t>
+      </w:r>
+      <w:proofErr w:type="spellEnd"/>
+      <w:r>
+        <w:rPr>
+          <w:lang w:val="de-CH"/>
+        </w:rPr>
+        <w:t xml:space="preserve"> Outcomes</w:t>
       </w:r>
       <w:bookmarkEnd w:id="11"/>
     </w:p>
@@ -4876,19 +5710,35 @@
         <w:rPr>
           <w:lang w:val="en-GB"/>
         </w:rPr>
-        <w:t>First, a latent behavioral driver is constructed as a weighted combination of key predictors:</w:t>
-      </w:r>
-      <w:r>
-        <w:rPr>
-          <w:lang w:val="en-GB"/>
-        </w:rPr>
-        <w:t xml:space="preserve"> </w:t>
-      </w:r>
-      <w:r>
-        <w:rPr>
-          <w:lang w:val="en-GB"/>
-        </w:rPr>
-        <w:t xml:space="preserve">habit, intention, perceived behavioral control, and autonomous motivation. </w:t>
+        <w:t xml:space="preserve">First, a latent </w:t>
+      </w:r>
+      <w:proofErr w:type="spellStart"/>
+      <w:r>
+        <w:rPr>
+          <w:lang w:val="en-GB"/>
+        </w:rPr>
+        <w:t>behavioral</w:t>
+      </w:r>
+      <w:proofErr w:type="spellEnd"/>
+      <w:r>
+        <w:rPr>
+          <w:lang w:val="en-GB"/>
+        </w:rPr>
+        <w:t xml:space="preserve"> driver is constructed as a weighted combination of key predictors: habit, intention, perceived </w:t>
+      </w:r>
+      <w:proofErr w:type="spellStart"/>
+      <w:r>
+        <w:rPr>
+          <w:lang w:val="en-GB"/>
+        </w:rPr>
+        <w:t>behavioral</w:t>
+      </w:r>
+      <w:proofErr w:type="spellEnd"/>
+      <w:r>
+        <w:rPr>
+          <w:lang w:val="en-GB"/>
+        </w:rPr>
+        <w:t xml:space="preserve"> control, and autonomous motivation. </w:t>
       </w:r>
     </w:p>
     <w:p>
@@ -4902,20 +5752,16 @@
           <w:lang w:val="en-GB"/>
         </w:rPr>
         <w:lastRenderedPageBreak/>
-        <w:t>This driver is</w:t>
-      </w:r>
-      <w:r>
-        <w:rPr>
-          <w:lang w:val="en-GB"/>
-        </w:rPr>
-        <w:t xml:space="preserve"> then</w:t>
-      </w:r>
-      <w:r>
-        <w:rPr>
-          <w:lang w:val="en-GB"/>
-        </w:rPr>
-        <w:t xml:space="preserve"> combined with:</w:t>
-      </w:r>
+        <w:t xml:space="preserve">This driver is then combined </w:t>
+      </w:r>
+      <w:proofErr w:type="gramStart"/>
+      <w:r>
+        <w:rPr>
+          <w:lang w:val="en-GB"/>
+        </w:rPr>
+        <w:t>with:</w:t>
+      </w:r>
+      <w:proofErr w:type="gramEnd"/>
       <w:r>
         <w:rPr>
           <w:lang w:val="en-GB"/>
@@ -4926,20 +5772,22 @@
         <w:rPr>
           <w:lang w:val="en-GB"/>
         </w:rPr>
-        <w:t xml:space="preserve">treatment and carryover effects, and </w:t>
-      </w:r>
-      <w:r>
-        <w:rPr>
-          <w:lang w:val="en-GB"/>
-        </w:rPr>
-        <w:t xml:space="preserve">also </w:t>
-      </w:r>
-      <w:r>
-        <w:rPr>
-          <w:lang w:val="en-GB"/>
-        </w:rPr>
-        <w:t>sociodemographic influences (see Section 3.3)</w:t>
-      </w:r>
+        <w:t xml:space="preserve">treatment and carryover effects, </w:t>
+      </w:r>
+      <w:proofErr w:type="gramStart"/>
+      <w:r>
+        <w:rPr>
+          <w:lang w:val="en-GB"/>
+        </w:rPr>
+        <w:t xml:space="preserve">and </w:t>
+      </w:r>
+      <w:r>
+        <w:rPr>
+          <w:lang w:val="en-GB"/>
+        </w:rPr>
+        <w:t>also</w:t>
+      </w:r>
+      <w:proofErr w:type="gramEnd"/>
       <w:r>
         <w:rPr>
           <w:lang w:val="en-GB"/>
@@ -4950,19 +5798,7 @@
         <w:rPr>
           <w:lang w:val="en-GB"/>
         </w:rPr>
-        <w:t>to generate daily step counts.</w:t>
-      </w:r>
-      <w:r>
-        <w:rPr>
-          <w:lang w:val="en-GB"/>
-        </w:rPr>
-        <w:t xml:space="preserve"> </w:t>
-      </w:r>
-      <w:r>
-        <w:rPr>
-          <w:lang w:val="en-GB"/>
-        </w:rPr>
-        <w:t>From step counts, weekly MET minutes are derived as an aggregated indicator of physical activity</w:t>
+        <w:t>sociodemographic influences (see Section 3.3) to generate daily step counts. From step counts, weekly MET minutes are derived as an aggregated indicator of physical activity</w:t>
       </w:r>
     </w:p>
     <w:p>
@@ -5003,7 +5839,21 @@
         <w:rPr>
           <w:lang w:val="de-CH"/>
         </w:rPr>
-        <w:t>These include:</w:t>
+        <w:t xml:space="preserve">These </w:t>
+      </w:r>
+      <w:proofErr w:type="spellStart"/>
+      <w:r>
+        <w:rPr>
+          <w:lang w:val="de-CH"/>
+        </w:rPr>
+        <w:t>include</w:t>
+      </w:r>
+      <w:proofErr w:type="spellEnd"/>
+      <w:r>
+        <w:rPr>
+          <w:lang w:val="de-CH"/>
+        </w:rPr>
+        <w:t>:</w:t>
       </w:r>
     </w:p>
     <w:p>
@@ -5020,7 +5870,21 @@
         <w:rPr>
           <w:lang w:val="en-GB"/>
         </w:rPr>
-        <w:t xml:space="preserve">number of active days per week (0–7), modeled using a binomial process, </w:t>
+        <w:t xml:space="preserve">number of active days per week (0–7), </w:t>
+      </w:r>
+      <w:proofErr w:type="spellStart"/>
+      <w:r>
+        <w:rPr>
+          <w:lang w:val="en-GB"/>
+        </w:rPr>
+        <w:t>modeled</w:t>
+      </w:r>
+      <w:proofErr w:type="spellEnd"/>
+      <w:r>
+        <w:rPr>
+          <w:lang w:val="en-GB"/>
+        </w:rPr>
+        <w:t xml:space="preserve"> using a binomial process, </w:t>
       </w:r>
     </w:p>
     <w:p>
@@ -5037,7 +5901,21 @@
         <w:rPr>
           <w:lang w:val="en-GB"/>
         </w:rPr>
-        <w:t xml:space="preserve">minutes per day, modeled using log-normal distributions conditional on activity occurrence. </w:t>
+        <w:t xml:space="preserve">minutes per day, </w:t>
+      </w:r>
+      <w:proofErr w:type="spellStart"/>
+      <w:r>
+        <w:rPr>
+          <w:lang w:val="en-GB"/>
+        </w:rPr>
+        <w:t>modeled</w:t>
+      </w:r>
+      <w:proofErr w:type="spellEnd"/>
+      <w:r>
+        <w:rPr>
+          <w:lang w:val="en-GB"/>
+        </w:rPr>
+        <w:t xml:space="preserve"> using log-normal distributions conditional on activity occurrence. </w:t>
       </w:r>
     </w:p>
     <w:p>
@@ -5121,11 +5999,47 @@
         </w:rPr>
         <w:t xml:space="preserve"> </w:t>
       </w:r>
+      <w:proofErr w:type="spellStart"/>
       <w:r>
         <w:rPr>
           <w:lang w:val="de-CH"/>
         </w:rPr>
-        <w:t>For each construct:</w:t>
+        <w:t>For</w:t>
+      </w:r>
+      <w:proofErr w:type="spellEnd"/>
+      <w:r>
+        <w:rPr>
+          <w:lang w:val="de-CH"/>
+        </w:rPr>
+        <w:t xml:space="preserve"> </w:t>
+      </w:r>
+      <w:proofErr w:type="spellStart"/>
+      <w:r>
+        <w:rPr>
+          <w:lang w:val="de-CH"/>
+        </w:rPr>
+        <w:t>each</w:t>
+      </w:r>
+      <w:proofErr w:type="spellEnd"/>
+      <w:r>
+        <w:rPr>
+          <w:lang w:val="de-CH"/>
+        </w:rPr>
+        <w:t xml:space="preserve"> </w:t>
+      </w:r>
+      <w:proofErr w:type="spellStart"/>
+      <w:r>
+        <w:rPr>
+          <w:lang w:val="de-CH"/>
+        </w:rPr>
+        <w:t>construct</w:t>
+      </w:r>
+      <w:proofErr w:type="spellEnd"/>
+      <w:r>
+        <w:rPr>
+          <w:lang w:val="de-CH"/>
+        </w:rPr>
+        <w:t>:</w:t>
       </w:r>
     </w:p>
     <w:p>
@@ -5142,7 +6056,49 @@
         <w:rPr>
           <w:lang w:val="de-CH"/>
         </w:rPr>
-        <w:t xml:space="preserve">multiple items are created, </w:t>
+        <w:t xml:space="preserve">multiple </w:t>
+      </w:r>
+      <w:proofErr w:type="spellStart"/>
+      <w:r>
+        <w:rPr>
+          <w:lang w:val="de-CH"/>
+        </w:rPr>
+        <w:t>items</w:t>
+      </w:r>
+      <w:proofErr w:type="spellEnd"/>
+      <w:r>
+        <w:rPr>
+          <w:lang w:val="de-CH"/>
+        </w:rPr>
+        <w:t xml:space="preserve"> </w:t>
+      </w:r>
+      <w:proofErr w:type="spellStart"/>
+      <w:r>
+        <w:rPr>
+          <w:lang w:val="de-CH"/>
+        </w:rPr>
+        <w:t>are</w:t>
+      </w:r>
+      <w:proofErr w:type="spellEnd"/>
+      <w:r>
+        <w:rPr>
+          <w:lang w:val="de-CH"/>
+        </w:rPr>
+        <w:t xml:space="preserve"> </w:t>
+      </w:r>
+      <w:proofErr w:type="spellStart"/>
+      <w:r>
+        <w:rPr>
+          <w:lang w:val="de-CH"/>
+        </w:rPr>
+        <w:t>created</w:t>
+      </w:r>
+      <w:proofErr w:type="spellEnd"/>
+      <w:r>
+        <w:rPr>
+          <w:lang w:val="de-CH"/>
+        </w:rPr>
+        <w:t xml:space="preserve">, </w:t>
       </w:r>
     </w:p>
     <w:p>
@@ -5249,7 +6205,35 @@
         <w:rPr>
           <w:lang w:val="en-GB"/>
         </w:rPr>
-        <w:t>The magnitude of the random error was adjusted to reflect empirically plausible variances, particularly for the ZiMo constructs, in order to match observed dispersion in empirical datasets.</w:t>
+        <w:t xml:space="preserve">The magnitude of the random error was adjusted to reflect empirically plausible variances, particularly for the </w:t>
+      </w:r>
+      <w:proofErr w:type="spellStart"/>
+      <w:r>
+        <w:rPr>
+          <w:lang w:val="en-GB"/>
+        </w:rPr>
+        <w:t>ZiMo</w:t>
+      </w:r>
+      <w:proofErr w:type="spellEnd"/>
+      <w:r>
+        <w:rPr>
+          <w:lang w:val="en-GB"/>
+        </w:rPr>
+        <w:t xml:space="preserve"> constructs, </w:t>
+      </w:r>
+      <w:proofErr w:type="gramStart"/>
+      <w:r>
+        <w:rPr>
+          <w:lang w:val="en-GB"/>
+        </w:rPr>
+        <w:t>in order to</w:t>
+      </w:r>
+      <w:proofErr w:type="gramEnd"/>
+      <w:r>
+        <w:rPr>
+          <w:lang w:val="en-GB"/>
+        </w:rPr>
+        <w:t xml:space="preserve"> match observed dispersion in empirical datasets.</w:t>
       </w:r>
     </w:p>
     <w:p>
@@ -5339,8 +6323,16 @@
         <w:rPr>
           <w:lang w:val="en-GB"/>
         </w:rPr>
-        <w:t xml:space="preserve"> observed items, including:</w:t>
-      </w:r>
+        <w:t xml:space="preserve"> observed items, </w:t>
+      </w:r>
+      <w:proofErr w:type="gramStart"/>
+      <w:r>
+        <w:rPr>
+          <w:lang w:val="en-GB"/>
+        </w:rPr>
+        <w:t>including:</w:t>
+      </w:r>
+      <w:proofErr w:type="gramEnd"/>
       <w:r>
         <w:rPr>
           <w:lang w:val="en-GB"/>
@@ -5363,7 +6355,35 @@
         <w:rPr>
           <w:lang w:val="en-GB"/>
         </w:rPr>
-        <w:t>and intention to use. In addition, app usage behavior is modeled probabilistically using a logistic function, with predictors including:</w:t>
+        <w:t xml:space="preserve">and intention to use. In addition, app usage </w:t>
+      </w:r>
+      <w:proofErr w:type="spellStart"/>
+      <w:r>
+        <w:rPr>
+          <w:lang w:val="en-GB"/>
+        </w:rPr>
+        <w:t>behavior</w:t>
+      </w:r>
+      <w:proofErr w:type="spellEnd"/>
+      <w:r>
+        <w:rPr>
+          <w:lang w:val="en-GB"/>
+        </w:rPr>
+        <w:t xml:space="preserve"> is </w:t>
+      </w:r>
+      <w:proofErr w:type="spellStart"/>
+      <w:r>
+        <w:rPr>
+          <w:lang w:val="en-GB"/>
+        </w:rPr>
+        <w:t>modeled</w:t>
+      </w:r>
+      <w:proofErr w:type="spellEnd"/>
+      <w:r>
+        <w:rPr>
+          <w:lang w:val="en-GB"/>
+        </w:rPr>
+        <w:t xml:space="preserve"> probabilistically using a logistic function, with predictors including:</w:t>
       </w:r>
     </w:p>
     <w:p>
@@ -5397,7 +6417,35 @@
         <w:rPr>
           <w:lang w:val="de-CH"/>
         </w:rPr>
-        <w:t xml:space="preserve">and treatment exposure. </w:t>
+        <w:t xml:space="preserve">and </w:t>
+      </w:r>
+      <w:proofErr w:type="spellStart"/>
+      <w:r>
+        <w:rPr>
+          <w:lang w:val="de-CH"/>
+        </w:rPr>
+        <w:t>treatment</w:t>
+      </w:r>
+      <w:proofErr w:type="spellEnd"/>
+      <w:r>
+        <w:rPr>
+          <w:lang w:val="de-CH"/>
+        </w:rPr>
+        <w:t xml:space="preserve"> </w:t>
+      </w:r>
+      <w:proofErr w:type="spellStart"/>
+      <w:r>
+        <w:rPr>
+          <w:lang w:val="de-CH"/>
+        </w:rPr>
+        <w:t>exposure</w:t>
+      </w:r>
+      <w:proofErr w:type="spellEnd"/>
+      <w:r>
+        <w:rPr>
+          <w:lang w:val="de-CH"/>
+        </w:rPr>
+        <w:t xml:space="preserve">. </w:t>
       </w:r>
     </w:p>
     <w:p>
@@ -5408,13 +6456,29 @@
         </w:rPr>
       </w:pPr>
       <w:bookmarkStart w:id="15" w:name="_Toc225439359"/>
+      <w:proofErr w:type="spellStart"/>
       <w:r>
         <w:rPr>
           <w:lang w:val="de-CH"/>
         </w:rPr>
-        <w:t>Missing Data Mechanisms</w:t>
+        <w:t>Missing</w:t>
+      </w:r>
+      <w:proofErr w:type="spellEnd"/>
+      <w:r>
+        <w:rPr>
+          <w:lang w:val="de-CH"/>
+        </w:rPr>
+        <w:t xml:space="preserve"> Data </w:t>
+      </w:r>
+      <w:proofErr w:type="spellStart"/>
+      <w:r>
+        <w:rPr>
+          <w:lang w:val="de-CH"/>
+        </w:rPr>
+        <w:t>Mechanisms</w:t>
       </w:r>
       <w:bookmarkEnd w:id="15"/>
+      <w:proofErr w:type="spellEnd"/>
     </w:p>
     <w:p>
       <w:pPr>
@@ -5601,7 +6665,49 @@
         <w:rPr>
           <w:lang w:val="de-CH"/>
         </w:rPr>
-        <w:t xml:space="preserve">latent and observed psychological constructs </w:t>
+        <w:t xml:space="preserve">latent and </w:t>
+      </w:r>
+      <w:proofErr w:type="spellStart"/>
+      <w:r>
+        <w:rPr>
+          <w:lang w:val="de-CH"/>
+        </w:rPr>
+        <w:t>observed</w:t>
+      </w:r>
+      <w:proofErr w:type="spellEnd"/>
+      <w:r>
+        <w:rPr>
+          <w:lang w:val="de-CH"/>
+        </w:rPr>
+        <w:t xml:space="preserve"> </w:t>
+      </w:r>
+      <w:proofErr w:type="spellStart"/>
+      <w:r>
+        <w:rPr>
+          <w:lang w:val="de-CH"/>
+        </w:rPr>
+        <w:t>psychological</w:t>
+      </w:r>
+      <w:proofErr w:type="spellEnd"/>
+      <w:r>
+        <w:rPr>
+          <w:lang w:val="de-CH"/>
+        </w:rPr>
+        <w:t xml:space="preserve"> </w:t>
+      </w:r>
+      <w:proofErr w:type="spellStart"/>
+      <w:r>
+        <w:rPr>
+          <w:lang w:val="de-CH"/>
+        </w:rPr>
+        <w:t>constructs</w:t>
+      </w:r>
+      <w:proofErr w:type="spellEnd"/>
+      <w:r>
+        <w:rPr>
+          <w:lang w:val="de-CH"/>
+        </w:rPr>
+        <w:t xml:space="preserve"> </w:t>
       </w:r>
     </w:p>
     <w:p>
@@ -5614,11 +6720,47 @@
           <w:lang w:val="de-CH"/>
         </w:rPr>
       </w:pPr>
+      <w:proofErr w:type="spellStart"/>
       <w:r>
         <w:rPr>
           <w:lang w:val="de-CH"/>
         </w:rPr>
-        <w:t xml:space="preserve">physical activity outcomes </w:t>
+        <w:t>physical</w:t>
+      </w:r>
+      <w:proofErr w:type="spellEnd"/>
+      <w:r>
+        <w:rPr>
+          <w:lang w:val="de-CH"/>
+        </w:rPr>
+        <w:t xml:space="preserve"> </w:t>
+      </w:r>
+      <w:proofErr w:type="spellStart"/>
+      <w:r>
+        <w:rPr>
+          <w:lang w:val="de-CH"/>
+        </w:rPr>
+        <w:t>activity</w:t>
+      </w:r>
+      <w:proofErr w:type="spellEnd"/>
+      <w:r>
+        <w:rPr>
+          <w:lang w:val="de-CH"/>
+        </w:rPr>
+        <w:t xml:space="preserve"> </w:t>
+      </w:r>
+      <w:proofErr w:type="spellStart"/>
+      <w:r>
+        <w:rPr>
+          <w:lang w:val="de-CH"/>
+        </w:rPr>
+        <w:t>outcomes</w:t>
+      </w:r>
+      <w:proofErr w:type="spellEnd"/>
+      <w:r>
+        <w:rPr>
+          <w:lang w:val="de-CH"/>
+        </w:rPr>
+        <w:t xml:space="preserve"> </w:t>
       </w:r>
     </w:p>
     <w:p>
@@ -5635,7 +6777,35 @@
         <w:rPr>
           <w:lang w:val="de-CH"/>
         </w:rPr>
-        <w:t xml:space="preserve">item-level survey responses </w:t>
+        <w:t xml:space="preserve">item-level </w:t>
+      </w:r>
+      <w:proofErr w:type="spellStart"/>
+      <w:r>
+        <w:rPr>
+          <w:lang w:val="de-CH"/>
+        </w:rPr>
+        <w:t>survey</w:t>
+      </w:r>
+      <w:proofErr w:type="spellEnd"/>
+      <w:r>
+        <w:rPr>
+          <w:lang w:val="de-CH"/>
+        </w:rPr>
+        <w:t xml:space="preserve"> </w:t>
+      </w:r>
+      <w:proofErr w:type="spellStart"/>
+      <w:r>
+        <w:rPr>
+          <w:lang w:val="de-CH"/>
+        </w:rPr>
+        <w:t>responses</w:t>
+      </w:r>
+      <w:proofErr w:type="spellEnd"/>
+      <w:r>
+        <w:rPr>
+          <w:lang w:val="de-CH"/>
+        </w:rPr>
+        <w:t xml:space="preserve"> </w:t>
       </w:r>
     </w:p>
     <w:p>
@@ -5648,11 +6818,19 @@
           <w:lang w:val="de-CH"/>
         </w:rPr>
       </w:pPr>
+      <w:proofErr w:type="spellStart"/>
       <w:r>
         <w:rPr>
           <w:lang w:val="de-CH"/>
         </w:rPr>
-        <w:t xml:space="preserve">sociodemographic variables </w:t>
+        <w:t>sociodemographic</w:t>
+      </w:r>
+      <w:proofErr w:type="spellEnd"/>
+      <w:r>
+        <w:rPr>
+          <w:lang w:val="de-CH"/>
+        </w:rPr>
+        <w:t xml:space="preserve"> variables </w:t>
       </w:r>
     </w:p>
     <w:p>
@@ -5710,7 +6888,21 @@
         <w:rPr>
           <w:lang w:val="en-GB"/>
         </w:rPr>
-        <w:t xml:space="preserve">The mapping script transforms the simulated dataset into a format that closely resembles a real LimeSurvey </w:t>
+        <w:t xml:space="preserve">The mapping script transforms the simulated dataset into a format that closely resembles a real </w:t>
+      </w:r>
+      <w:proofErr w:type="spellStart"/>
+      <w:r>
+        <w:rPr>
+          <w:lang w:val="en-GB"/>
+        </w:rPr>
+        <w:t>LimeSurvey</w:t>
+      </w:r>
+      <w:proofErr w:type="spellEnd"/>
+      <w:r>
+        <w:rPr>
+          <w:lang w:val="en-GB"/>
+        </w:rPr>
+        <w:t xml:space="preserve"> </w:t>
       </w:r>
       <w:r>
         <w:rPr>
@@ -5735,7 +6927,21 @@
         <w:rPr>
           <w:lang w:val="en-GB"/>
         </w:rPr>
-        <w:t>To achieve this, a template file based on an actual LimeSurvey export is used as a structural reference. An empty dataset with identical column names is created, and the simulated data are subsequently inserted and aligned with this structure. This template-based approach ensures that variable naming conventions, data formats, and overall structure are fully compatible with the original survey.</w:t>
+        <w:t xml:space="preserve">To achieve this, a template file based on an actual </w:t>
+      </w:r>
+      <w:proofErr w:type="spellStart"/>
+      <w:r>
+        <w:rPr>
+          <w:lang w:val="en-GB"/>
+        </w:rPr>
+        <w:t>LimeSurvey</w:t>
+      </w:r>
+      <w:proofErr w:type="spellEnd"/>
+      <w:r>
+        <w:rPr>
+          <w:lang w:val="en-GB"/>
+        </w:rPr>
+        <w:t xml:space="preserve"> export is used as a structural reference. An empty dataset with identical column names is created, and the simulated data are subsequently inserted and aligned with this structure. This template-based approach ensures that variable naming conventions, data formats, and overall structure are fully compatible with the original survey.</w:t>
       </w:r>
     </w:p>
     <w:p>
@@ -5990,7 +7196,49 @@
         <w:rPr>
           <w:lang w:val="de-CH"/>
         </w:rPr>
-        <w:t>This includes verifying that:</w:t>
+        <w:t xml:space="preserve">This </w:t>
+      </w:r>
+      <w:proofErr w:type="spellStart"/>
+      <w:r>
+        <w:rPr>
+          <w:lang w:val="de-CH"/>
+        </w:rPr>
+        <w:t>includes</w:t>
+      </w:r>
+      <w:proofErr w:type="spellEnd"/>
+      <w:r>
+        <w:rPr>
+          <w:lang w:val="de-CH"/>
+        </w:rPr>
+        <w:t xml:space="preserve"> </w:t>
+      </w:r>
+      <w:proofErr w:type="spellStart"/>
+      <w:r>
+        <w:rPr>
+          <w:lang w:val="de-CH"/>
+        </w:rPr>
+        <w:t>verifying</w:t>
+      </w:r>
+      <w:proofErr w:type="spellEnd"/>
+      <w:r>
+        <w:rPr>
+          <w:lang w:val="de-CH"/>
+        </w:rPr>
+        <w:t xml:space="preserve"> </w:t>
+      </w:r>
+      <w:proofErr w:type="spellStart"/>
+      <w:r>
+        <w:rPr>
+          <w:lang w:val="de-CH"/>
+        </w:rPr>
+        <w:t>that</w:t>
+      </w:r>
+      <w:proofErr w:type="spellEnd"/>
+      <w:r>
+        <w:rPr>
+          <w:lang w:val="de-CH"/>
+        </w:rPr>
+        <w:t>:</w:t>
       </w:r>
     </w:p>
     <w:p>
@@ -6104,9 +7352,14 @@
         <w:pStyle w:val="berschrift1"/>
       </w:pPr>
       <w:bookmarkStart w:id="24" w:name="_Toc225439368"/>
+      <w:proofErr w:type="spellStart"/>
       <w:r>
         <w:lastRenderedPageBreak/>
-        <w:t>Reproducibility and Workflow</w:t>
+        <w:t>Reproducibility</w:t>
+      </w:r>
+      <w:proofErr w:type="spellEnd"/>
+      <w:r>
+        <w:t xml:space="preserve"> and Workflow</w:t>
       </w:r>
       <w:bookmarkEnd w:id="24"/>
     </w:p>
@@ -6195,7 +7448,21 @@
         <w:rPr>
           <w:lang w:val="en-GB"/>
         </w:rPr>
-        <w:t xml:space="preserve">Transforms the simulated dataset into a format compatible with LimeSurvey exports. </w:t>
+        <w:t xml:space="preserve">Transforms the simulated dataset into a format compatible with </w:t>
+      </w:r>
+      <w:proofErr w:type="spellStart"/>
+      <w:r>
+        <w:rPr>
+          <w:lang w:val="en-GB"/>
+        </w:rPr>
+        <w:t>LimeSurvey</w:t>
+      </w:r>
+      <w:proofErr w:type="spellEnd"/>
+      <w:r>
+        <w:rPr>
+          <w:lang w:val="en-GB"/>
+        </w:rPr>
+        <w:t xml:space="preserve"> exports. </w:t>
       </w:r>
     </w:p>
     <w:p>
@@ -6253,11 +7520,19 @@
         </w:rPr>
         <w:t xml:space="preserve">the simulation script (R), the mapping script (R), </w:t>
       </w:r>
-      <w:r>
-        <w:rPr>
-          <w:lang w:val="en-GB"/>
-        </w:rPr>
-        <w:t xml:space="preserve">and also </w:t>
+      <w:proofErr w:type="gramStart"/>
+      <w:r>
+        <w:rPr>
+          <w:lang w:val="en-GB"/>
+        </w:rPr>
+        <w:t>and also</w:t>
+      </w:r>
+      <w:proofErr w:type="gramEnd"/>
+      <w:r>
+        <w:rPr>
+          <w:lang w:val="en-GB"/>
+        </w:rPr>
+        <w:t xml:space="preserve"> </w:t>
       </w:r>
       <w:r>
         <w:rPr>
@@ -6275,7 +7550,21 @@
         <w:rPr>
           <w:lang w:val="en-GB"/>
         </w:rPr>
-        <w:t xml:space="preserve">file based on a LimeSurvey </w:t>
+        <w:t xml:space="preserve">file based on a </w:t>
+      </w:r>
+      <w:proofErr w:type="spellStart"/>
+      <w:r>
+        <w:rPr>
+          <w:lang w:val="en-GB"/>
+        </w:rPr>
+        <w:t>LimeSurvey</w:t>
+      </w:r>
+      <w:proofErr w:type="spellEnd"/>
+      <w:r>
+        <w:rPr>
+          <w:lang w:val="en-GB"/>
+        </w:rPr>
+        <w:t xml:space="preserve"> </w:t>
       </w:r>
       <w:r>
         <w:rPr>
@@ -6311,7 +7600,21 @@
         <w:rPr>
           <w:lang w:val="en-GB"/>
         </w:rPr>
-        <w:t xml:space="preserve">a CSV file containing the simulated dataset, and an Excel file that mirrors the structure of a LimeSurvey export. </w:t>
+        <w:t xml:space="preserve">a CSV file containing the simulated dataset, and an Excel file that mirrors the structure of a </w:t>
+      </w:r>
+      <w:proofErr w:type="spellStart"/>
+      <w:r>
+        <w:rPr>
+          <w:lang w:val="en-GB"/>
+        </w:rPr>
+        <w:t>LimeSurvey</w:t>
+      </w:r>
+      <w:proofErr w:type="spellEnd"/>
+      <w:r>
+        <w:rPr>
+          <w:lang w:val="en-GB"/>
+        </w:rPr>
+        <w:t xml:space="preserve"> export. </w:t>
       </w:r>
     </w:p>
     <w:p>
@@ -6324,7 +7627,63 @@
         <w:rPr>
           <w:lang w:val="en-GB"/>
         </w:rPr>
-        <w:t>All scripts rely on standard R packages (e.g., dplyr, tidyr, MASS, readxl, openxlsx, lme4) and can be executed independently once the required input files are available.</w:t>
+        <w:t xml:space="preserve">All scripts rely on standard R packages (e.g., </w:t>
+      </w:r>
+      <w:proofErr w:type="spellStart"/>
+      <w:r>
+        <w:rPr>
+          <w:lang w:val="en-GB"/>
+        </w:rPr>
+        <w:t>dplyr</w:t>
+      </w:r>
+      <w:proofErr w:type="spellEnd"/>
+      <w:r>
+        <w:rPr>
+          <w:lang w:val="en-GB"/>
+        </w:rPr>
+        <w:t xml:space="preserve">, </w:t>
+      </w:r>
+      <w:proofErr w:type="spellStart"/>
+      <w:r>
+        <w:rPr>
+          <w:lang w:val="en-GB"/>
+        </w:rPr>
+        <w:t>tidyr</w:t>
+      </w:r>
+      <w:proofErr w:type="spellEnd"/>
+      <w:r>
+        <w:rPr>
+          <w:lang w:val="en-GB"/>
+        </w:rPr>
+        <w:t xml:space="preserve">, MASS, </w:t>
+      </w:r>
+      <w:proofErr w:type="spellStart"/>
+      <w:r>
+        <w:rPr>
+          <w:lang w:val="en-GB"/>
+        </w:rPr>
+        <w:t>readxl</w:t>
+      </w:r>
+      <w:proofErr w:type="spellEnd"/>
+      <w:r>
+        <w:rPr>
+          <w:lang w:val="en-GB"/>
+        </w:rPr>
+        <w:t xml:space="preserve">, </w:t>
+      </w:r>
+      <w:proofErr w:type="spellStart"/>
+      <w:r>
+        <w:rPr>
+          <w:lang w:val="en-GB"/>
+        </w:rPr>
+        <w:t>openxlsx</w:t>
+      </w:r>
+      <w:proofErr w:type="spellEnd"/>
+      <w:r>
+        <w:rPr>
+          <w:lang w:val="en-GB"/>
+        </w:rPr>
+        <w:t>, lme4) and can be executed independently once the required input files are available.</w:t>
       </w:r>
     </w:p>
     <w:p>
@@ -6365,13 +7724,7 @@
         <w:rPr>
           <w:lang w:val="en-GB"/>
         </w:rPr>
-        <w:t xml:space="preserve">. </w:t>
-      </w:r>
-      <w:r>
-        <w:rPr>
-          <w:lang w:val="en-GB"/>
-        </w:rPr>
-        <w:t>This applies to constructs such as habit, planning, and motivational profiles (e.g., BMZI).</w:t>
+        <w:t>. This applies to constructs such as habit, planning, and motivational profiles (e.g., BMZI).</w:t>
       </w:r>
     </w:p>
     <w:p>
@@ -6409,7 +7762,21 @@
         <w:rPr>
           <w:lang w:val="en-GB"/>
         </w:rPr>
-        <w:t>Intervention effects were modeled to reflect realistic but clearly detectable changes. While the direction of effects is grounded in empirical findings, their magnitude was calibrated pragmatically to ensure interpretable patterns in the simulated data.</w:t>
+        <w:t xml:space="preserve">Intervention effects were </w:t>
+      </w:r>
+      <w:proofErr w:type="spellStart"/>
+      <w:r>
+        <w:rPr>
+          <w:lang w:val="en-GB"/>
+        </w:rPr>
+        <w:t>modeled</w:t>
+      </w:r>
+      <w:proofErr w:type="spellEnd"/>
+      <w:r>
+        <w:rPr>
+          <w:lang w:val="en-GB"/>
+        </w:rPr>
+        <w:t xml:space="preserve"> to reflect realistic but clearly detectable changes. While the direction of effects is grounded in empirical findings, their magnitude was calibrated pragmatically to ensure interpretable patterns in the simulated data.</w:t>
       </w:r>
     </w:p>
     <w:p>
@@ -6452,7 +7819,35 @@
         <w:rPr>
           <w:lang w:val="en-GB"/>
         </w:rPr>
-        <w:t>First, the dataset is synthetic and therefore cannot fully capture the complexity and variability of real-world data. Behavioral processes are simplified, and some relationships between variables are modeled in a linear and additive way.</w:t>
+        <w:t xml:space="preserve">First, the dataset is synthetic and therefore cannot fully capture the complexity and variability of real-world data. </w:t>
+      </w:r>
+      <w:proofErr w:type="spellStart"/>
+      <w:r>
+        <w:rPr>
+          <w:lang w:val="en-GB"/>
+        </w:rPr>
+        <w:t>Behavioral</w:t>
+      </w:r>
+      <w:proofErr w:type="spellEnd"/>
+      <w:r>
+        <w:rPr>
+          <w:lang w:val="en-GB"/>
+        </w:rPr>
+        <w:t xml:space="preserve"> processes are simplified, and some relationships between variables are </w:t>
+      </w:r>
+      <w:proofErr w:type="spellStart"/>
+      <w:r>
+        <w:rPr>
+          <w:lang w:val="en-GB"/>
+        </w:rPr>
+        <w:t>modeled</w:t>
+      </w:r>
+      <w:proofErr w:type="spellEnd"/>
+      <w:r>
+        <w:rPr>
+          <w:lang w:val="en-GB"/>
+        </w:rPr>
+        <w:t xml:space="preserve"> in a linear and additive way.</w:t>
       </w:r>
       <w:r>
         <w:rPr>
@@ -6556,6 +7951,7 @@
                 <w:lang w:val="en-GB"/>
               </w:rPr>
             </w:pPr>
+            <w:proofErr w:type="spellStart"/>
             <w:r>
               <w:rPr>
                 <w:rFonts w:cs="Arial"/>
@@ -6565,6 +7961,7 @@
               </w:rPr>
               <w:t>Construct</w:t>
             </w:r>
+            <w:proofErr w:type="spellEnd"/>
           </w:p>
         </w:tc>
         <w:tc>
@@ -6721,7 +8118,27 @@
                 <w:szCs w:val="20"/>
                 <w:lang w:val="de-CH"/>
               </w:rPr>
-              <w:t>Mean (baseline)</w:t>
+              <w:t>Mean (</w:t>
+            </w:r>
+            <w:proofErr w:type="spellStart"/>
+            <w:r>
+              <w:rPr>
+                <w:rFonts w:cs="Arial"/>
+                <w:sz w:val="20"/>
+                <w:szCs w:val="20"/>
+                <w:lang w:val="de-CH"/>
+              </w:rPr>
+              <w:t>baseline</w:t>
+            </w:r>
+            <w:proofErr w:type="spellEnd"/>
+            <w:r>
+              <w:rPr>
+                <w:rFonts w:cs="Arial"/>
+                <w:sz w:val="20"/>
+                <w:szCs w:val="20"/>
+                <w:lang w:val="de-CH"/>
+              </w:rPr>
+              <w:t>)</w:t>
             </w:r>
           </w:p>
         </w:tc>
@@ -6903,7 +8320,27 @@
                 <w:szCs w:val="20"/>
                 <w:lang w:val="de-CH"/>
               </w:rPr>
-              <w:t>SD (between)</w:t>
+              <w:t>SD (</w:t>
+            </w:r>
+            <w:proofErr w:type="spellStart"/>
+            <w:r>
+              <w:rPr>
+                <w:rFonts w:cs="Arial"/>
+                <w:sz w:val="20"/>
+                <w:szCs w:val="20"/>
+                <w:lang w:val="de-CH"/>
+              </w:rPr>
+              <w:t>between</w:t>
+            </w:r>
+            <w:proofErr w:type="spellEnd"/>
+            <w:r>
+              <w:rPr>
+                <w:rFonts w:cs="Arial"/>
+                <w:sz w:val="20"/>
+                <w:szCs w:val="20"/>
+                <w:lang w:val="de-CH"/>
+              </w:rPr>
+              <w:t>)</w:t>
             </w:r>
           </w:p>
         </w:tc>
@@ -7012,6 +8449,7 @@
                 <w:lang w:val="en-GB"/>
               </w:rPr>
             </w:pPr>
+            <w:proofErr w:type="spellStart"/>
             <w:r>
               <w:rPr>
                 <w:rFonts w:cs="Arial"/>
@@ -7019,8 +8457,69 @@
                 <w:szCs w:val="20"/>
                 <w:lang w:val="de-CH"/>
               </w:rPr>
-              <w:t>Aligned with reported variability</w:t>
-            </w:r>
+              <w:t>Aligned</w:t>
+            </w:r>
+            <w:proofErr w:type="spellEnd"/>
+            <w:r>
+              <w:rPr>
+                <w:rFonts w:cs="Arial"/>
+                <w:sz w:val="20"/>
+                <w:szCs w:val="20"/>
+                <w:lang w:val="de-CH"/>
+              </w:rPr>
+              <w:t xml:space="preserve"> </w:t>
+            </w:r>
+            <w:proofErr w:type="spellStart"/>
+            <w:r>
+              <w:rPr>
+                <w:rFonts w:cs="Arial"/>
+                <w:sz w:val="20"/>
+                <w:szCs w:val="20"/>
+                <w:lang w:val="de-CH"/>
+              </w:rPr>
+              <w:t>with</w:t>
+            </w:r>
+            <w:proofErr w:type="spellEnd"/>
+            <w:r>
+              <w:rPr>
+                <w:rFonts w:cs="Arial"/>
+                <w:sz w:val="20"/>
+                <w:szCs w:val="20"/>
+                <w:lang w:val="de-CH"/>
+              </w:rPr>
+              <w:t xml:space="preserve"> </w:t>
+            </w:r>
+            <w:proofErr w:type="spellStart"/>
+            <w:r>
+              <w:rPr>
+                <w:rFonts w:cs="Arial"/>
+                <w:sz w:val="20"/>
+                <w:szCs w:val="20"/>
+                <w:lang w:val="de-CH"/>
+              </w:rPr>
+              <w:t>reported</w:t>
+            </w:r>
+            <w:proofErr w:type="spellEnd"/>
+            <w:r>
+              <w:rPr>
+                <w:rFonts w:cs="Arial"/>
+                <w:sz w:val="20"/>
+                <w:szCs w:val="20"/>
+                <w:lang w:val="de-CH"/>
+              </w:rPr>
+              <w:t xml:space="preserve"> </w:t>
+            </w:r>
+            <w:proofErr w:type="spellStart"/>
+            <w:r>
+              <w:rPr>
+                <w:rFonts w:cs="Arial"/>
+                <w:sz w:val="20"/>
+                <w:szCs w:val="20"/>
+                <w:lang w:val="de-CH"/>
+              </w:rPr>
+              <w:t>variability</w:t>
+            </w:r>
+            <w:proofErr w:type="spellEnd"/>
           </w:p>
         </w:tc>
       </w:tr>
@@ -7067,8 +8566,19 @@
                 <w:szCs w:val="20"/>
                 <w:lang w:val="de-CH"/>
               </w:rPr>
-              <w:t>Intervention effect</w:t>
-            </w:r>
+              <w:t xml:space="preserve">Intervention </w:t>
+            </w:r>
+            <w:proofErr w:type="spellStart"/>
+            <w:r>
+              <w:rPr>
+                <w:rFonts w:cs="Arial"/>
+                <w:sz w:val="20"/>
+                <w:szCs w:val="20"/>
+                <w:lang w:val="de-CH"/>
+              </w:rPr>
+              <w:t>effect</w:t>
+            </w:r>
+            <w:proofErr w:type="spellEnd"/>
           </w:p>
         </w:tc>
         <w:tc>
@@ -7241,8 +8751,39 @@
                 <w:szCs w:val="20"/>
                 <w:lang w:val="de-CH"/>
               </w:rPr>
-              <w:t>Intention–Behavior correlation</w:t>
-            </w:r>
+              <w:t>Intention–</w:t>
+            </w:r>
+            <w:proofErr w:type="spellStart"/>
+            <w:r>
+              <w:rPr>
+                <w:rFonts w:cs="Arial"/>
+                <w:sz w:val="20"/>
+                <w:szCs w:val="20"/>
+                <w:lang w:val="de-CH"/>
+              </w:rPr>
+              <w:t>Behavior</w:t>
+            </w:r>
+            <w:proofErr w:type="spellEnd"/>
+            <w:r>
+              <w:rPr>
+                <w:rFonts w:cs="Arial"/>
+                <w:sz w:val="20"/>
+                <w:szCs w:val="20"/>
+                <w:lang w:val="de-CH"/>
+              </w:rPr>
+              <w:t xml:space="preserve"> </w:t>
+            </w:r>
+            <w:proofErr w:type="spellStart"/>
+            <w:r>
+              <w:rPr>
+                <w:rFonts w:cs="Arial"/>
+                <w:sz w:val="20"/>
+                <w:szCs w:val="20"/>
+                <w:lang w:val="de-CH"/>
+              </w:rPr>
+              <w:t>correlation</w:t>
+            </w:r>
+            <w:proofErr w:type="spellEnd"/>
           </w:p>
         </w:tc>
         <w:tc>
@@ -7350,6 +8891,7 @@
                 <w:lang w:val="en-GB"/>
               </w:rPr>
             </w:pPr>
+            <w:proofErr w:type="spellStart"/>
             <w:r>
               <w:rPr>
                 <w:rFonts w:cs="Arial"/>
@@ -7357,8 +8899,69 @@
                 <w:szCs w:val="20"/>
                 <w:lang w:val="de-CH"/>
               </w:rPr>
-              <w:t>Used for correlation matrix</w:t>
-            </w:r>
+              <w:t>Used</w:t>
+            </w:r>
+            <w:proofErr w:type="spellEnd"/>
+            <w:r>
+              <w:rPr>
+                <w:rFonts w:cs="Arial"/>
+                <w:sz w:val="20"/>
+                <w:szCs w:val="20"/>
+                <w:lang w:val="de-CH"/>
+              </w:rPr>
+              <w:t xml:space="preserve"> </w:t>
+            </w:r>
+            <w:proofErr w:type="spellStart"/>
+            <w:r>
+              <w:rPr>
+                <w:rFonts w:cs="Arial"/>
+                <w:sz w:val="20"/>
+                <w:szCs w:val="20"/>
+                <w:lang w:val="de-CH"/>
+              </w:rPr>
+              <w:t>for</w:t>
+            </w:r>
+            <w:proofErr w:type="spellEnd"/>
+            <w:r>
+              <w:rPr>
+                <w:rFonts w:cs="Arial"/>
+                <w:sz w:val="20"/>
+                <w:szCs w:val="20"/>
+                <w:lang w:val="de-CH"/>
+              </w:rPr>
+              <w:t xml:space="preserve"> </w:t>
+            </w:r>
+            <w:proofErr w:type="spellStart"/>
+            <w:r>
+              <w:rPr>
+                <w:rFonts w:cs="Arial"/>
+                <w:sz w:val="20"/>
+                <w:szCs w:val="20"/>
+                <w:lang w:val="de-CH"/>
+              </w:rPr>
+              <w:t>correlation</w:t>
+            </w:r>
+            <w:proofErr w:type="spellEnd"/>
+            <w:r>
+              <w:rPr>
+                <w:rFonts w:cs="Arial"/>
+                <w:sz w:val="20"/>
+                <w:szCs w:val="20"/>
+                <w:lang w:val="de-CH"/>
+              </w:rPr>
+              <w:t xml:space="preserve"> </w:t>
+            </w:r>
+            <w:proofErr w:type="spellStart"/>
+            <w:r>
+              <w:rPr>
+                <w:rFonts w:cs="Arial"/>
+                <w:sz w:val="20"/>
+                <w:szCs w:val="20"/>
+                <w:lang w:val="de-CH"/>
+              </w:rPr>
+              <w:t>matrix</w:t>
+            </w:r>
+            <w:proofErr w:type="spellEnd"/>
           </w:p>
         </w:tc>
       </w:tr>
@@ -7405,8 +9008,39 @@
                 <w:szCs w:val="20"/>
                 <w:lang w:val="de-CH"/>
               </w:rPr>
-              <w:t>PBC–Behavior correlation</w:t>
-            </w:r>
+              <w:t>PBC–</w:t>
+            </w:r>
+            <w:proofErr w:type="spellStart"/>
+            <w:r>
+              <w:rPr>
+                <w:rFonts w:cs="Arial"/>
+                <w:sz w:val="20"/>
+                <w:szCs w:val="20"/>
+                <w:lang w:val="de-CH"/>
+              </w:rPr>
+              <w:t>Behavior</w:t>
+            </w:r>
+            <w:proofErr w:type="spellEnd"/>
+            <w:r>
+              <w:rPr>
+                <w:rFonts w:cs="Arial"/>
+                <w:sz w:val="20"/>
+                <w:szCs w:val="20"/>
+                <w:lang w:val="de-CH"/>
+              </w:rPr>
+              <w:t xml:space="preserve"> </w:t>
+            </w:r>
+            <w:proofErr w:type="spellStart"/>
+            <w:r>
+              <w:rPr>
+                <w:rFonts w:cs="Arial"/>
+                <w:sz w:val="20"/>
+                <w:szCs w:val="20"/>
+                <w:lang w:val="de-CH"/>
+              </w:rPr>
+              <w:t>correlation</w:t>
+            </w:r>
+            <w:proofErr w:type="spellEnd"/>
           </w:p>
         </w:tc>
         <w:tc>
@@ -7514,6 +9148,7 @@
                 <w:lang w:val="en-GB"/>
               </w:rPr>
             </w:pPr>
+            <w:proofErr w:type="spellStart"/>
             <w:r>
               <w:rPr>
                 <w:rFonts w:cs="Arial"/>
@@ -7521,8 +9156,29 @@
                 <w:szCs w:val="20"/>
                 <w:lang w:val="de-CH"/>
               </w:rPr>
-              <w:t>Reflected in simulation</w:t>
-            </w:r>
+              <w:t>Reflected</w:t>
+            </w:r>
+            <w:proofErr w:type="spellEnd"/>
+            <w:r>
+              <w:rPr>
+                <w:rFonts w:cs="Arial"/>
+                <w:sz w:val="20"/>
+                <w:szCs w:val="20"/>
+                <w:lang w:val="de-CH"/>
+              </w:rPr>
+              <w:t xml:space="preserve"> in </w:t>
+            </w:r>
+            <w:proofErr w:type="spellStart"/>
+            <w:r>
+              <w:rPr>
+                <w:rFonts w:cs="Arial"/>
+                <w:sz w:val="20"/>
+                <w:szCs w:val="20"/>
+                <w:lang w:val="de-CH"/>
+              </w:rPr>
+              <w:t>simulation</w:t>
+            </w:r>
+            <w:proofErr w:type="spellEnd"/>
           </w:p>
         </w:tc>
       </w:tr>
@@ -7569,8 +9225,19 @@
                 <w:szCs w:val="20"/>
                 <w:lang w:val="de-CH"/>
               </w:rPr>
-              <w:t>Attitude–Intention correlation</w:t>
-            </w:r>
+              <w:t xml:space="preserve">Attitude–Intention </w:t>
+            </w:r>
+            <w:proofErr w:type="spellStart"/>
+            <w:r>
+              <w:rPr>
+                <w:rFonts w:cs="Arial"/>
+                <w:sz w:val="20"/>
+                <w:szCs w:val="20"/>
+                <w:lang w:val="de-CH"/>
+              </w:rPr>
+              <w:t>correlation</w:t>
+            </w:r>
+            <w:proofErr w:type="spellEnd"/>
           </w:p>
         </w:tc>
         <w:tc>
@@ -7678,6 +9345,7 @@
                 <w:lang w:val="en-GB"/>
               </w:rPr>
             </w:pPr>
+            <w:proofErr w:type="spellStart"/>
             <w:r>
               <w:rPr>
                 <w:rFonts w:cs="Arial"/>
@@ -7685,8 +9353,29 @@
                 <w:szCs w:val="20"/>
                 <w:lang w:val="de-CH"/>
               </w:rPr>
-              <w:t>Implemented via latent structure</w:t>
-            </w:r>
+              <w:t>Implemented</w:t>
+            </w:r>
+            <w:proofErr w:type="spellEnd"/>
+            <w:r>
+              <w:rPr>
+                <w:rFonts w:cs="Arial"/>
+                <w:sz w:val="20"/>
+                <w:szCs w:val="20"/>
+                <w:lang w:val="de-CH"/>
+              </w:rPr>
+              <w:t xml:space="preserve"> via latent </w:t>
+            </w:r>
+            <w:proofErr w:type="spellStart"/>
+            <w:r>
+              <w:rPr>
+                <w:rFonts w:cs="Arial"/>
+                <w:sz w:val="20"/>
+                <w:szCs w:val="20"/>
+                <w:lang w:val="de-CH"/>
+              </w:rPr>
+              <w:t>structure</w:t>
+            </w:r>
+            <w:proofErr w:type="spellEnd"/>
           </w:p>
         </w:tc>
       </w:tr>
@@ -7733,7 +9422,27 @@
                 <w:szCs w:val="20"/>
                 <w:lang w:val="de-CH"/>
               </w:rPr>
-              <w:t>Means (all constructs)</w:t>
+              <w:t xml:space="preserve">Means (all </w:t>
+            </w:r>
+            <w:proofErr w:type="spellStart"/>
+            <w:r>
+              <w:rPr>
+                <w:rFonts w:cs="Arial"/>
+                <w:sz w:val="20"/>
+                <w:szCs w:val="20"/>
+                <w:lang w:val="de-CH"/>
+              </w:rPr>
+              <w:t>constructs</w:t>
+            </w:r>
+            <w:proofErr w:type="spellEnd"/>
+            <w:r>
+              <w:rPr>
+                <w:rFonts w:cs="Arial"/>
+                <w:sz w:val="20"/>
+                <w:szCs w:val="20"/>
+                <w:lang w:val="de-CH"/>
+              </w:rPr>
+              <w:t>)</w:t>
             </w:r>
           </w:p>
         </w:tc>
@@ -7900,6 +9609,7 @@
                 <w:lang w:val="en-GB"/>
               </w:rPr>
             </w:pPr>
+            <w:proofErr w:type="spellStart"/>
             <w:r>
               <w:rPr>
                 <w:rFonts w:cs="Arial"/>
@@ -7907,7 +9617,57 @@
                 <w:szCs w:val="20"/>
                 <w:lang w:val="de-CH"/>
               </w:rPr>
-              <w:t>Autonomous motivation (mean)</w:t>
+              <w:t>Autonomous</w:t>
+            </w:r>
+            <w:proofErr w:type="spellEnd"/>
+            <w:r>
+              <w:rPr>
+                <w:rFonts w:cs="Arial"/>
+                <w:sz w:val="20"/>
+                <w:szCs w:val="20"/>
+                <w:lang w:val="de-CH"/>
+              </w:rPr>
+              <w:t xml:space="preserve"> </w:t>
+            </w:r>
+            <w:proofErr w:type="spellStart"/>
+            <w:r>
+              <w:rPr>
+                <w:rFonts w:cs="Arial"/>
+                <w:sz w:val="20"/>
+                <w:szCs w:val="20"/>
+                <w:lang w:val="de-CH"/>
+              </w:rPr>
+              <w:t>motivation</w:t>
+            </w:r>
+            <w:proofErr w:type="spellEnd"/>
+            <w:r>
+              <w:rPr>
+                <w:rFonts w:cs="Arial"/>
+                <w:sz w:val="20"/>
+                <w:szCs w:val="20"/>
+                <w:lang w:val="de-CH"/>
+              </w:rPr>
+              <w:t xml:space="preserve"> (</w:t>
+            </w:r>
+            <w:proofErr w:type="spellStart"/>
+            <w:r>
+              <w:rPr>
+                <w:rFonts w:cs="Arial"/>
+                <w:sz w:val="20"/>
+                <w:szCs w:val="20"/>
+                <w:lang w:val="de-CH"/>
+              </w:rPr>
+              <w:t>mean</w:t>
+            </w:r>
+            <w:proofErr w:type="spellEnd"/>
+            <w:r>
+              <w:rPr>
+                <w:rFonts w:cs="Arial"/>
+                <w:sz w:val="20"/>
+                <w:szCs w:val="20"/>
+                <w:lang w:val="de-CH"/>
+              </w:rPr>
+              <w:t>)</w:t>
             </w:r>
           </w:p>
         </w:tc>
@@ -8356,6 +10116,7 @@
                 <w:lang w:val="en-GB"/>
               </w:rPr>
             </w:pPr>
+            <w:proofErr w:type="spellStart"/>
             <w:r>
               <w:rPr>
                 <w:rFonts w:cs="Arial"/>
@@ -8363,8 +10124,29 @@
                 <w:szCs w:val="20"/>
                 <w:lang w:val="de-CH"/>
               </w:rPr>
-              <w:t>Directly used</w:t>
-            </w:r>
+              <w:t>Directly</w:t>
+            </w:r>
+            <w:proofErr w:type="spellEnd"/>
+            <w:r>
+              <w:rPr>
+                <w:rFonts w:cs="Arial"/>
+                <w:sz w:val="20"/>
+                <w:szCs w:val="20"/>
+                <w:lang w:val="de-CH"/>
+              </w:rPr>
+              <w:t xml:space="preserve"> </w:t>
+            </w:r>
+            <w:proofErr w:type="spellStart"/>
+            <w:r>
+              <w:rPr>
+                <w:rFonts w:cs="Arial"/>
+                <w:sz w:val="20"/>
+                <w:szCs w:val="20"/>
+                <w:lang w:val="de-CH"/>
+              </w:rPr>
+              <w:t>used</w:t>
+            </w:r>
+            <w:proofErr w:type="spellEnd"/>
           </w:p>
         </w:tc>
       </w:tr>
@@ -8520,6 +10302,7 @@
                 <w:lang w:val="en-GB"/>
               </w:rPr>
             </w:pPr>
+            <w:proofErr w:type="spellStart"/>
             <w:r>
               <w:rPr>
                 <w:rFonts w:cs="Arial"/>
@@ -8527,8 +10310,29 @@
                 <w:szCs w:val="20"/>
                 <w:lang w:val="de-CH"/>
               </w:rPr>
-              <w:t>Directly used</w:t>
-            </w:r>
+              <w:t>Directly</w:t>
+            </w:r>
+            <w:proofErr w:type="spellEnd"/>
+            <w:r>
+              <w:rPr>
+                <w:rFonts w:cs="Arial"/>
+                <w:sz w:val="20"/>
+                <w:szCs w:val="20"/>
+                <w:lang w:val="de-CH"/>
+              </w:rPr>
+              <w:t xml:space="preserve"> </w:t>
+            </w:r>
+            <w:proofErr w:type="spellStart"/>
+            <w:r>
+              <w:rPr>
+                <w:rFonts w:cs="Arial"/>
+                <w:sz w:val="20"/>
+                <w:szCs w:val="20"/>
+                <w:lang w:val="de-CH"/>
+              </w:rPr>
+              <w:t>used</w:t>
+            </w:r>
+            <w:proofErr w:type="spellEnd"/>
           </w:p>
         </w:tc>
       </w:tr>
@@ -8568,6 +10372,7 @@
                 <w:lang w:val="en-GB"/>
               </w:rPr>
             </w:pPr>
+            <w:proofErr w:type="spellStart"/>
             <w:r>
               <w:rPr>
                 <w:rFonts w:cs="Arial"/>
@@ -8575,7 +10380,17 @@
                 <w:szCs w:val="20"/>
                 <w:lang w:val="de-CH"/>
               </w:rPr>
-              <w:t>Effect on PA</w:t>
+              <w:t>Effect</w:t>
+            </w:r>
+            <w:proofErr w:type="spellEnd"/>
+            <w:r>
+              <w:rPr>
+                <w:rFonts w:cs="Arial"/>
+                <w:sz w:val="20"/>
+                <w:szCs w:val="20"/>
+                <w:lang w:val="de-CH"/>
+              </w:rPr>
+              <w:t xml:space="preserve"> on PA</w:t>
             </w:r>
           </w:p>
         </w:tc>
@@ -8684,6 +10499,7 @@
                 <w:lang w:val="en-GB"/>
               </w:rPr>
             </w:pPr>
+            <w:proofErr w:type="spellStart"/>
             <w:r>
               <w:rPr>
                 <w:rFonts w:cs="Arial"/>
@@ -8691,8 +10507,9 @@
                 <w:szCs w:val="20"/>
                 <w:lang w:val="de-CH"/>
               </w:rPr>
-              <w:t>Slightly calibrated</w:t>
-            </w:r>
+              <w:t>Slightly</w:t>
+            </w:r>
+            <w:proofErr w:type="spellEnd"/>
             <w:r>
               <w:rPr>
                 <w:rFonts w:cs="Arial"/>
@@ -8700,8 +10517,29 @@
                 <w:szCs w:val="20"/>
                 <w:lang w:val="de-CH"/>
               </w:rPr>
+              <w:t xml:space="preserve"> </w:t>
+            </w:r>
+            <w:proofErr w:type="spellStart"/>
+            <w:r>
+              <w:rPr>
+                <w:rFonts w:cs="Arial"/>
+                <w:sz w:val="20"/>
+                <w:szCs w:val="20"/>
+                <w:lang w:val="de-CH"/>
+              </w:rPr>
+              <w:t>calibrated</w:t>
+            </w:r>
+            <w:proofErr w:type="spellEnd"/>
+            <w:r>
+              <w:rPr>
+                <w:rFonts w:cs="Arial"/>
+                <w:sz w:val="20"/>
+                <w:szCs w:val="20"/>
+                <w:lang w:val="de-CH"/>
+              </w:rPr>
               <w:t xml:space="preserve"> (</w:t>
             </w:r>
+            <w:proofErr w:type="spellStart"/>
             <w:r>
               <w:rPr>
                 <w:rFonts w:cs="Arial"/>
@@ -8709,7 +10547,37 @@
                 <w:szCs w:val="20"/>
                 <w:lang w:val="de-CH"/>
               </w:rPr>
-              <w:t>adjusted downwards)</w:t>
+              <w:t>adjusted</w:t>
+            </w:r>
+            <w:proofErr w:type="spellEnd"/>
+            <w:r>
+              <w:rPr>
+                <w:rFonts w:cs="Arial"/>
+                <w:sz w:val="20"/>
+                <w:szCs w:val="20"/>
+                <w:lang w:val="de-CH"/>
+              </w:rPr>
+              <w:t xml:space="preserve"> </w:t>
+            </w:r>
+            <w:proofErr w:type="spellStart"/>
+            <w:r>
+              <w:rPr>
+                <w:rFonts w:cs="Arial"/>
+                <w:sz w:val="20"/>
+                <w:szCs w:val="20"/>
+                <w:lang w:val="de-CH"/>
+              </w:rPr>
+              <w:t>downwards</w:t>
+            </w:r>
+            <w:proofErr w:type="spellEnd"/>
+            <w:r>
+              <w:rPr>
+                <w:rFonts w:cs="Arial"/>
+                <w:sz w:val="20"/>
+                <w:szCs w:val="20"/>
+                <w:lang w:val="de-CH"/>
+              </w:rPr>
+              <w:t>)</w:t>
             </w:r>
           </w:p>
         </w:tc>
@@ -8740,8 +10608,20 @@
                 <w:szCs w:val="20"/>
                 <w:lang w:val="de-CH"/>
               </w:rPr>
-              <w:t>Self-control</w:t>
-            </w:r>
+              <w:t>Self-</w:t>
+            </w:r>
+            <w:proofErr w:type="spellStart"/>
+            <w:r>
+              <w:rPr>
+                <w:rFonts w:cs="Arial"/>
+                <w:i/>
+                <w:sz w:val="20"/>
+                <w:szCs w:val="20"/>
+                <w:lang w:val="de-CH"/>
+              </w:rPr>
+              <w:t>control</w:t>
+            </w:r>
+            <w:proofErr w:type="spellEnd"/>
           </w:p>
         </w:tc>
         <w:tc>
@@ -8760,6 +10640,7 @@
                 <w:lang w:val="en-GB"/>
               </w:rPr>
             </w:pPr>
+            <w:proofErr w:type="spellStart"/>
             <w:r>
               <w:rPr>
                 <w:rFonts w:cs="Arial"/>
@@ -8767,8 +10648,29 @@
                 <w:szCs w:val="20"/>
                 <w:lang w:val="de-CH"/>
               </w:rPr>
-              <w:t>Reliability reference</w:t>
-            </w:r>
+              <w:t>Reliability</w:t>
+            </w:r>
+            <w:proofErr w:type="spellEnd"/>
+            <w:r>
+              <w:rPr>
+                <w:rFonts w:cs="Arial"/>
+                <w:sz w:val="20"/>
+                <w:szCs w:val="20"/>
+                <w:lang w:val="de-CH"/>
+              </w:rPr>
+              <w:t xml:space="preserve"> </w:t>
+            </w:r>
+            <w:proofErr w:type="spellStart"/>
+            <w:r>
+              <w:rPr>
+                <w:rFonts w:cs="Arial"/>
+                <w:sz w:val="20"/>
+                <w:szCs w:val="20"/>
+                <w:lang w:val="de-CH"/>
+              </w:rPr>
+              <w:t>reference</w:t>
+            </w:r>
+            <w:proofErr w:type="spellEnd"/>
           </w:p>
         </w:tc>
         <w:tc>
@@ -8876,6 +10778,7 @@
                 <w:lang w:val="en-GB"/>
               </w:rPr>
             </w:pPr>
+            <w:proofErr w:type="spellStart"/>
             <w:r>
               <w:rPr>
                 <w:rFonts w:cs="Arial"/>
@@ -8883,8 +10786,49 @@
                 <w:szCs w:val="20"/>
                 <w:lang w:val="de-CH"/>
               </w:rPr>
-              <w:t>Used for plausibility</w:t>
-            </w:r>
+              <w:t>Used</w:t>
+            </w:r>
+            <w:proofErr w:type="spellEnd"/>
+            <w:r>
+              <w:rPr>
+                <w:rFonts w:cs="Arial"/>
+                <w:sz w:val="20"/>
+                <w:szCs w:val="20"/>
+                <w:lang w:val="de-CH"/>
+              </w:rPr>
+              <w:t xml:space="preserve"> </w:t>
+            </w:r>
+            <w:proofErr w:type="spellStart"/>
+            <w:r>
+              <w:rPr>
+                <w:rFonts w:cs="Arial"/>
+                <w:sz w:val="20"/>
+                <w:szCs w:val="20"/>
+                <w:lang w:val="de-CH"/>
+              </w:rPr>
+              <w:t>for</w:t>
+            </w:r>
+            <w:proofErr w:type="spellEnd"/>
+            <w:r>
+              <w:rPr>
+                <w:rFonts w:cs="Arial"/>
+                <w:sz w:val="20"/>
+                <w:szCs w:val="20"/>
+                <w:lang w:val="de-CH"/>
+              </w:rPr>
+              <w:t xml:space="preserve"> </w:t>
+            </w:r>
+            <w:proofErr w:type="spellStart"/>
+            <w:r>
+              <w:rPr>
+                <w:rFonts w:cs="Arial"/>
+                <w:sz w:val="20"/>
+                <w:szCs w:val="20"/>
+                <w:lang w:val="de-CH"/>
+              </w:rPr>
+              <w:t>plausibility</w:t>
+            </w:r>
+            <w:proofErr w:type="spellEnd"/>
           </w:p>
         </w:tc>
       </w:tr>
@@ -8914,8 +10858,20 @@
                 <w:szCs w:val="20"/>
                 <w:lang w:val="de-CH"/>
               </w:rPr>
-              <w:t>BMZI motives</w:t>
-            </w:r>
+              <w:t xml:space="preserve">BMZI </w:t>
+            </w:r>
+            <w:proofErr w:type="spellStart"/>
+            <w:r>
+              <w:rPr>
+                <w:rFonts w:cs="Arial"/>
+                <w:i/>
+                <w:sz w:val="20"/>
+                <w:szCs w:val="20"/>
+                <w:lang w:val="de-CH"/>
+              </w:rPr>
+              <w:t>motives</w:t>
+            </w:r>
+            <w:proofErr w:type="spellEnd"/>
           </w:p>
         </w:tc>
         <w:tc>
@@ -9050,6 +11006,7 @@
                 <w:lang w:val="en-GB"/>
               </w:rPr>
             </w:pPr>
+            <w:proofErr w:type="spellStart"/>
             <w:r>
               <w:rPr>
                 <w:rFonts w:cs="Arial"/>
@@ -9057,8 +11014,29 @@
                 <w:szCs w:val="20"/>
                 <w:lang w:val="de-CH"/>
               </w:rPr>
-              <w:t>Directly used</w:t>
-            </w:r>
+              <w:t>Directly</w:t>
+            </w:r>
+            <w:proofErr w:type="spellEnd"/>
+            <w:r>
+              <w:rPr>
+                <w:rFonts w:cs="Arial"/>
+                <w:sz w:val="20"/>
+                <w:szCs w:val="20"/>
+                <w:lang w:val="de-CH"/>
+              </w:rPr>
+              <w:t xml:space="preserve"> </w:t>
+            </w:r>
+            <w:proofErr w:type="spellStart"/>
+            <w:r>
+              <w:rPr>
+                <w:rFonts w:cs="Arial"/>
+                <w:sz w:val="20"/>
+                <w:szCs w:val="20"/>
+                <w:lang w:val="de-CH"/>
+              </w:rPr>
+              <w:t>used</w:t>
+            </w:r>
+            <w:proofErr w:type="spellEnd"/>
           </w:p>
         </w:tc>
       </w:tr>
@@ -9105,8 +11083,19 @@
                 <w:szCs w:val="20"/>
                 <w:lang w:val="de-CH"/>
               </w:rPr>
-              <w:t>Body/Appearance</w:t>
-            </w:r>
+              <w:t>Body/</w:t>
+            </w:r>
+            <w:proofErr w:type="spellStart"/>
+            <w:r>
+              <w:rPr>
+                <w:rFonts w:cs="Arial"/>
+                <w:sz w:val="20"/>
+                <w:szCs w:val="20"/>
+                <w:lang w:val="de-CH"/>
+              </w:rPr>
+              <w:t>Appearance</w:t>
+            </w:r>
+            <w:proofErr w:type="spellEnd"/>
           </w:p>
         </w:tc>
         <w:tc>
@@ -9214,6 +11203,7 @@
                 <w:lang w:val="en-GB"/>
               </w:rPr>
             </w:pPr>
+            <w:proofErr w:type="spellStart"/>
             <w:r>
               <w:rPr>
                 <w:rFonts w:cs="Arial"/>
@@ -9221,8 +11211,29 @@
                 <w:szCs w:val="20"/>
                 <w:lang w:val="de-CH"/>
               </w:rPr>
-              <w:t>Directly used</w:t>
-            </w:r>
+              <w:t>Directly</w:t>
+            </w:r>
+            <w:proofErr w:type="spellEnd"/>
+            <w:r>
+              <w:rPr>
+                <w:rFonts w:cs="Arial"/>
+                <w:sz w:val="20"/>
+                <w:szCs w:val="20"/>
+                <w:lang w:val="de-CH"/>
+              </w:rPr>
+              <w:t xml:space="preserve"> </w:t>
+            </w:r>
+            <w:proofErr w:type="spellStart"/>
+            <w:r>
+              <w:rPr>
+                <w:rFonts w:cs="Arial"/>
+                <w:sz w:val="20"/>
+                <w:szCs w:val="20"/>
+                <w:lang w:val="de-CH"/>
+              </w:rPr>
+              <w:t>used</w:t>
+            </w:r>
+            <w:proofErr w:type="spellEnd"/>
           </w:p>
         </w:tc>
       </w:tr>
@@ -9262,6 +11273,7 @@
                 <w:lang w:val="en-GB"/>
               </w:rPr>
             </w:pPr>
+            <w:proofErr w:type="spellStart"/>
             <w:r>
               <w:rPr>
                 <w:rFonts w:cs="Arial"/>
@@ -9269,7 +11281,17 @@
                 <w:szCs w:val="20"/>
                 <w:lang w:val="de-CH"/>
               </w:rPr>
-              <w:t>Social/Contact</w:t>
+              <w:t>Social</w:t>
+            </w:r>
+            <w:proofErr w:type="spellEnd"/>
+            <w:r>
+              <w:rPr>
+                <w:rFonts w:cs="Arial"/>
+                <w:sz w:val="20"/>
+                <w:szCs w:val="20"/>
+                <w:lang w:val="de-CH"/>
+              </w:rPr>
+              <w:t>/Contact</w:t>
             </w:r>
           </w:p>
         </w:tc>
@@ -9378,6 +11400,7 @@
                 <w:lang w:val="en-GB"/>
               </w:rPr>
             </w:pPr>
+            <w:proofErr w:type="spellStart"/>
             <w:r>
               <w:rPr>
                 <w:rFonts w:cs="Arial"/>
@@ -9385,8 +11408,29 @@
                 <w:szCs w:val="20"/>
                 <w:lang w:val="de-CH"/>
               </w:rPr>
-              <w:t>Directly used</w:t>
-            </w:r>
+              <w:t>Directly</w:t>
+            </w:r>
+            <w:proofErr w:type="spellEnd"/>
+            <w:r>
+              <w:rPr>
+                <w:rFonts w:cs="Arial"/>
+                <w:sz w:val="20"/>
+                <w:szCs w:val="20"/>
+                <w:lang w:val="de-CH"/>
+              </w:rPr>
+              <w:t xml:space="preserve"> </w:t>
+            </w:r>
+            <w:proofErr w:type="spellStart"/>
+            <w:r>
+              <w:rPr>
+                <w:rFonts w:cs="Arial"/>
+                <w:sz w:val="20"/>
+                <w:szCs w:val="20"/>
+                <w:lang w:val="de-CH"/>
+              </w:rPr>
+              <w:t>used</w:t>
+            </w:r>
+            <w:proofErr w:type="spellEnd"/>
           </w:p>
         </w:tc>
       </w:tr>
@@ -9542,6 +11586,7 @@
                 <w:lang w:val="en-GB"/>
               </w:rPr>
             </w:pPr>
+            <w:proofErr w:type="spellStart"/>
             <w:r>
               <w:rPr>
                 <w:rFonts w:cs="Arial"/>
@@ -9549,8 +11594,29 @@
                 <w:szCs w:val="20"/>
                 <w:lang w:val="de-CH"/>
               </w:rPr>
-              <w:t>Directly used</w:t>
-            </w:r>
+              <w:t>Directly</w:t>
+            </w:r>
+            <w:proofErr w:type="spellEnd"/>
+            <w:r>
+              <w:rPr>
+                <w:rFonts w:cs="Arial"/>
+                <w:sz w:val="20"/>
+                <w:szCs w:val="20"/>
+                <w:lang w:val="de-CH"/>
+              </w:rPr>
+              <w:t xml:space="preserve"> </w:t>
+            </w:r>
+            <w:proofErr w:type="spellStart"/>
+            <w:r>
+              <w:rPr>
+                <w:rFonts w:cs="Arial"/>
+                <w:sz w:val="20"/>
+                <w:szCs w:val="20"/>
+                <w:lang w:val="de-CH"/>
+              </w:rPr>
+              <w:t>used</w:t>
+            </w:r>
+            <w:proofErr w:type="spellEnd"/>
           </w:p>
         </w:tc>
       </w:tr>
@@ -9590,6 +11656,7 @@
                 <w:lang w:val="en-GB"/>
               </w:rPr>
             </w:pPr>
+            <w:proofErr w:type="spellStart"/>
             <w:r>
               <w:rPr>
                 <w:rFonts w:cs="Arial"/>
@@ -9599,6 +11666,7 @@
               </w:rPr>
               <w:t>Distraction</w:t>
             </w:r>
+            <w:proofErr w:type="spellEnd"/>
           </w:p>
         </w:tc>
         <w:tc>
@@ -9706,6 +11774,7 @@
                 <w:lang w:val="en-GB"/>
               </w:rPr>
             </w:pPr>
+            <w:proofErr w:type="spellStart"/>
             <w:r>
               <w:rPr>
                 <w:rFonts w:cs="Arial"/>
@@ -9713,8 +11782,29 @@
                 <w:szCs w:val="20"/>
                 <w:lang w:val="de-CH"/>
               </w:rPr>
-              <w:t>Directly used</w:t>
-            </w:r>
+              <w:t>Directly</w:t>
+            </w:r>
+            <w:proofErr w:type="spellEnd"/>
+            <w:r>
+              <w:rPr>
+                <w:rFonts w:cs="Arial"/>
+                <w:sz w:val="20"/>
+                <w:szCs w:val="20"/>
+                <w:lang w:val="de-CH"/>
+              </w:rPr>
+              <w:t xml:space="preserve"> </w:t>
+            </w:r>
+            <w:proofErr w:type="spellStart"/>
+            <w:r>
+              <w:rPr>
+                <w:rFonts w:cs="Arial"/>
+                <w:sz w:val="20"/>
+                <w:szCs w:val="20"/>
+                <w:lang w:val="de-CH"/>
+              </w:rPr>
+              <w:t>used</w:t>
+            </w:r>
+            <w:proofErr w:type="spellEnd"/>
           </w:p>
         </w:tc>
       </w:tr>
@@ -9754,6 +11844,7 @@
                 <w:lang w:val="en-GB"/>
               </w:rPr>
             </w:pPr>
+            <w:proofErr w:type="spellStart"/>
             <w:r>
               <w:rPr>
                 <w:rFonts w:cs="Arial"/>
@@ -9763,6 +11854,7 @@
               </w:rPr>
               <w:t>Aesthetics</w:t>
             </w:r>
+            <w:proofErr w:type="spellEnd"/>
           </w:p>
         </w:tc>
         <w:tc>
@@ -9870,6 +11962,7 @@
                 <w:lang w:val="en-GB"/>
               </w:rPr>
             </w:pPr>
+            <w:proofErr w:type="spellStart"/>
             <w:r>
               <w:rPr>
                 <w:rFonts w:cs="Arial"/>
@@ -9877,8 +11970,29 @@
                 <w:szCs w:val="20"/>
                 <w:lang w:val="de-CH"/>
               </w:rPr>
-              <w:t>Directly used</w:t>
-            </w:r>
+              <w:t>Directly</w:t>
+            </w:r>
+            <w:proofErr w:type="spellEnd"/>
+            <w:r>
+              <w:rPr>
+                <w:rFonts w:cs="Arial"/>
+                <w:sz w:val="20"/>
+                <w:szCs w:val="20"/>
+                <w:lang w:val="de-CH"/>
+              </w:rPr>
+              <w:t xml:space="preserve"> </w:t>
+            </w:r>
+            <w:proofErr w:type="spellStart"/>
+            <w:r>
+              <w:rPr>
+                <w:rFonts w:cs="Arial"/>
+                <w:sz w:val="20"/>
+                <w:szCs w:val="20"/>
+                <w:lang w:val="de-CH"/>
+              </w:rPr>
+              <w:t>used</w:t>
+            </w:r>
+            <w:proofErr w:type="spellEnd"/>
           </w:p>
         </w:tc>
       </w:tr>
@@ -10252,13 +12366,31 @@
               </w:rPr>
               <w:t xml:space="preserve">Mean </w:t>
             </w:r>
-            <w:r>
-              <w:rPr>
-                <w:sz w:val="20"/>
-                <w:szCs w:val="20"/>
-              </w:rPr>
-              <w:t>Activation/Enjoyment</w:t>
-            </w:r>
+            <w:proofErr w:type="spellStart"/>
+            <w:r>
+              <w:rPr>
+                <w:sz w:val="20"/>
+                <w:szCs w:val="20"/>
+              </w:rPr>
+              <w:t>Activation</w:t>
+            </w:r>
+            <w:proofErr w:type="spellEnd"/>
+            <w:r>
+              <w:rPr>
+                <w:sz w:val="20"/>
+                <w:szCs w:val="20"/>
+              </w:rPr>
+              <w:t>/</w:t>
+            </w:r>
+            <w:proofErr w:type="spellStart"/>
+            <w:r>
+              <w:rPr>
+                <w:sz w:val="20"/>
+                <w:szCs w:val="20"/>
+              </w:rPr>
+              <w:t>Enjoyment</w:t>
+            </w:r>
+            <w:proofErr w:type="spellEnd"/>
           </w:p>
         </w:tc>
         <w:tc>
@@ -10415,13 +12547,31 @@
               </w:rPr>
               <w:t xml:space="preserve">SD   </w:t>
             </w:r>
-            <w:r>
-              <w:rPr>
-                <w:sz w:val="20"/>
-                <w:szCs w:val="20"/>
-              </w:rPr>
-              <w:t>Activation/Enjoyment</w:t>
-            </w:r>
+            <w:proofErr w:type="spellStart"/>
+            <w:r>
+              <w:rPr>
+                <w:sz w:val="20"/>
+                <w:szCs w:val="20"/>
+              </w:rPr>
+              <w:t>Activation</w:t>
+            </w:r>
+            <w:proofErr w:type="spellEnd"/>
+            <w:r>
+              <w:rPr>
+                <w:sz w:val="20"/>
+                <w:szCs w:val="20"/>
+              </w:rPr>
+              <w:t>/</w:t>
+            </w:r>
+            <w:proofErr w:type="spellStart"/>
+            <w:r>
+              <w:rPr>
+                <w:sz w:val="20"/>
+                <w:szCs w:val="20"/>
+              </w:rPr>
+              <w:t>Enjoyment</w:t>
+            </w:r>
+            <w:proofErr w:type="spellEnd"/>
           </w:p>
         </w:tc>
         <w:tc>
@@ -10995,8 +13145,18 @@
                 <w:szCs w:val="20"/>
                 <w:lang w:val="de-CH"/>
               </w:rPr>
-              <w:t>Mean range</w:t>
-            </w:r>
+              <w:t xml:space="preserve">Mean </w:t>
+            </w:r>
+            <w:proofErr w:type="spellStart"/>
+            <w:r>
+              <w:rPr>
+                <w:sz w:val="20"/>
+                <w:szCs w:val="20"/>
+                <w:lang w:val="de-CH"/>
+              </w:rPr>
+              <w:t>range</w:t>
+            </w:r>
+            <w:proofErr w:type="spellEnd"/>
           </w:p>
         </w:tc>
         <w:tc>
@@ -11682,6 +13842,7 @@
                 <w:lang w:val="en-GB"/>
               </w:rPr>
             </w:pPr>
+            <w:proofErr w:type="spellStart"/>
             <w:r>
               <w:rPr>
                 <w:i/>
@@ -11691,6 +13852,7 @@
               </w:rPr>
               <w:t>Sociodemographics</w:t>
             </w:r>
+            <w:proofErr w:type="spellEnd"/>
           </w:p>
         </w:tc>
         <w:tc>
@@ -11823,6 +13985,7 @@
                 <w:lang w:val="en-GB"/>
               </w:rPr>
             </w:pPr>
+            <w:proofErr w:type="spellStart"/>
             <w:r>
               <w:rPr>
                 <w:sz w:val="20"/>
@@ -11831,6 +13994,7 @@
               </w:rPr>
               <w:t>Calibrated</w:t>
             </w:r>
+            <w:proofErr w:type="spellEnd"/>
           </w:p>
         </w:tc>
       </w:tr>
@@ -11852,6 +14016,7 @@
                 <w:lang w:val="en-GB"/>
               </w:rPr>
             </w:pPr>
+            <w:proofErr w:type="spellStart"/>
             <w:r>
               <w:rPr>
                 <w:i/>
@@ -11859,8 +14024,29 @@
                 <w:szCs w:val="20"/>
                 <w:lang w:val="de-CH"/>
               </w:rPr>
-              <w:t>Missing data</w:t>
-            </w:r>
+              <w:t>Missing</w:t>
+            </w:r>
+            <w:proofErr w:type="spellEnd"/>
+            <w:r>
+              <w:rPr>
+                <w:i/>
+                <w:sz w:val="20"/>
+                <w:szCs w:val="20"/>
+                <w:lang w:val="de-CH"/>
+              </w:rPr>
+              <w:t xml:space="preserve"> </w:t>
+            </w:r>
+            <w:proofErr w:type="spellStart"/>
+            <w:r>
+              <w:rPr>
+                <w:i/>
+                <w:sz w:val="20"/>
+                <w:szCs w:val="20"/>
+                <w:lang w:val="de-CH"/>
+              </w:rPr>
+              <w:t>data</w:t>
+            </w:r>
+            <w:proofErr w:type="spellEnd"/>
           </w:p>
         </w:tc>
         <w:tc>
@@ -11962,6 +14148,7 @@
                 <w:rFonts w:cs="Arial"/>
                 <w:sz w:val="20"/>
                 <w:szCs w:val="20"/>
+                <w:lang w:val="en-GB"/>
               </w:rPr>
               <w:t>Loughnane et al., (2025)</w:t>
             </w:r>
@@ -11996,7 +14183,7 @@
               <w:rPr>
                 <w:sz w:val="20"/>
                 <w:szCs w:val="20"/>
-                <w:lang w:val="de-CH"/>
+                <w:lang w:val="en-GB"/>
               </w:rPr>
               <w:t>Calibrated</w:t>
             </w:r>
@@ -12046,6 +14233,7 @@
         <w:rPr>
           <w:lang w:val="en-GB"/>
         </w:rPr>
+        <w:lastRenderedPageBreak/>
         <w:t>References</w:t>
       </w:r>
       <w:bookmarkEnd w:id="29"/>
@@ -12420,7 +14608,17 @@
           <w:szCs w:val="21"/>
           <w:lang w:val="en-GB"/>
         </w:rPr>
-        <w:t xml:space="preserve">Systematic review exploring human, AI, and hybrid health coaching in digital health interventions: Trends, engagement, and lifestyle outcomes. </w:t>
+        <w:t xml:space="preserve">Systematic review exploring human, AI, and hybrid health coaching in digital health interventions: Trends, engagement, and </w:t>
+      </w:r>
+      <w:r>
+        <w:rPr>
+          <w:rFonts w:cs="Arial"/>
+          <w:sz w:val="21"/>
+          <w:szCs w:val="21"/>
+          <w:lang w:val="en-GB"/>
+        </w:rPr>
+        <w:lastRenderedPageBreak/>
+        <w:t xml:space="preserve">lifestyle outcomes. </w:t>
       </w:r>
       <w:r>
         <w:rPr>
@@ -12865,7 +15063,6 @@
         <w:docPartUnique/>
       </w:docPartObj>
     </w:sdtPr>
-    <w:sdtEndPr/>
     <w:sdtContent>
       <w:p>
         <w:pPr>
@@ -12909,7 +15106,6 @@
         <w:docPartUnique/>
       </w:docPartObj>
     </w:sdtPr>
-    <w:sdtEndPr/>
     <w:sdtContent>
       <w:p>
         <w:pPr>
@@ -18371,7 +20567,6 @@
   <w:style w:type="character" w:default="1" w:styleId="Absatz-Standardschriftart">
     <w:name w:val="Default Paragraph Font"/>
     <w:uiPriority w:val="1"/>
-    <w:semiHidden/>
     <w:unhideWhenUsed/>
   </w:style>
   <w:style w:type="table" w:default="1" w:styleId="NormaleTabelle">

</xml_diff>